<commit_message>
Visual and wording fixes after feedback
- zkratka AV
- dashboard UI
- word templating
- AV logo
- SVG now editable
- acknowledgements and authorship
</commit_message>
<xml_diff>
--- a/word-templates/shrnuti-template.docx
+++ b/word-templates/shrnuti-template.docx
@@ -1,11 +1,13 @@
 
 <file path=word/document.xml><?xml version="1.0" encoding="utf-8"?>
-<w:document xmlns:wpc="http://schemas.microsoft.com/office/word/2010/wordprocessingCanvas" xmlns:cx="http://schemas.microsoft.com/office/drawing/2014/chartex" xmlns:cx1="http://schemas.microsoft.com/office/drawing/2015/9/8/chartex" xmlns:cx2="http://schemas.microsoft.com/office/drawing/2015/10/21/chartex" xmlns:cx3="http://schemas.microsoft.com/office/drawing/2016/5/9/chartex" xmlns:cx4="http://schemas.microsoft.com/office/drawing/2016/5/10/chartex" xmlns:cx5="http://schemas.microsoft.com/office/drawing/2016/5/11/chartex" xmlns:cx6="http://schemas.microsoft.com/office/drawing/2016/5/12/chartex" xmlns:cx7="http://schemas.microsoft.com/office/drawing/2016/5/13/chartex" xmlns:cx8="http://schemas.microsoft.com/office/drawing/2016/5/14/chartex" xmlns:mc="http://schemas.openxmlformats.org/markup-compatibility/2006" xmlns:m="http://schemas.openxmlformats.org/officeDocument/2006/math" xmlns:aink="http://schemas.microsoft.com/office/drawing/2016/ink" xmlns:am3d="http://schemas.microsoft.com/office/drawing/2017/model3d" xmlns:oel="http://schemas.microsoft.com/office/2019/extlst" xmlns:r="http://schemas.openxmlformats.org/officeDocument/2006/relationships" xmlns:wp14="http://schemas.microsoft.com/office/word/2010/wordprocessingDrawing" xmlns:wp="http://schemas.openxmlformats.org/drawingml/2006/wordprocessingDrawing" xmlns:wpg="http://schemas.microsoft.com/office/word/2010/wordprocessingGroup" xmlns:wpi="http://schemas.microsoft.com/office/word/2010/wordprocessingInk" xmlns:wps="http://schemas.microsoft.com/office/word/2010/wordprocessingShape" xmlns:o="urn:schemas-microsoft-com:office:office" xmlns:v="urn:schemas-microsoft-com:vml" xmlns:w10="urn:schemas-microsoft-com:office:word" xmlns:w="http://schemas.openxmlformats.org/wordprocessingml/2006/main" xmlns:w14="http://schemas.microsoft.com/office/word/2010/wordml" xmlns:w15="http://schemas.microsoft.com/office/word/2012/wordml" xmlns:w16cex="http://schemas.microsoft.com/office/word/2018/wordml/cex" xmlns:w16cid="http://schemas.microsoft.com/office/word/2016/wordml/cid" xmlns:w16="http://schemas.microsoft.com/office/word/2018/wordml" xmlns:w16sdtdh="http://schemas.microsoft.com/office/word/2020/wordml/sdtdatahash" xmlns:w16sdtfl="http://schemas.microsoft.com/office/word/2024/wordml/sdtformatlock" xmlns:w16se="http://schemas.microsoft.com/office/word/2015/wordml/symex" xmlns:w16du="http://schemas.microsoft.com/office/word/2023/wordml/word16du" xmlns:wne="http://schemas.microsoft.com/office/word/2006/wordml" mc:Ignorable="w14 w15 w16se w16cid w16 w16cex w16sdtdh w16sdtfl w16du wp14">
+<w:document xmlns:wpc="http://schemas.microsoft.com/office/word/2010/wordprocessingCanvas" xmlns:cx="http://schemas.microsoft.com/office/drawing/2014/chartex" xmlns:cx1="http://schemas.microsoft.com/office/drawing/2015/9/8/chartex" xmlns:cx2="http://schemas.microsoft.com/office/drawing/2015/10/21/chartex" xmlns:cx3="http://schemas.microsoft.com/office/drawing/2016/5/9/chartex" xmlns:cx4="http://schemas.microsoft.com/office/drawing/2016/5/10/chartex" xmlns:cx5="http://schemas.microsoft.com/office/drawing/2016/5/11/chartex" xmlns:cx6="http://schemas.microsoft.com/office/drawing/2016/5/12/chartex" xmlns:cx7="http://schemas.microsoft.com/office/drawing/2016/5/13/chartex" xmlns:cx8="http://schemas.microsoft.com/office/drawing/2016/5/14/chartex" xmlns:mc="http://schemas.openxmlformats.org/markup-compatibility/2006" xmlns:m="http://schemas.openxmlformats.org/officeDocument/2006/math" xmlns:aink="http://schemas.microsoft.com/office/drawing/2016/ink" xmlns:am3d="http://schemas.microsoft.com/office/drawing/2017/model3d" xmlns:oel="http://schemas.microsoft.com/office/2019/extlst" xmlns:r="http://schemas.openxmlformats.org/officeDocument/2006/relationships" xmlns:wp14="http://schemas.microsoft.com/office/word/2010/wordprocessingDrawing" xmlns:wp="http://schemas.openxmlformats.org/drawingml/2006/wordprocessingDrawing" xmlns:wpg="http://schemas.microsoft.com/office/word/2010/wordprocessingGroup" xmlns:wpi="http://schemas.microsoft.com/office/word/2010/wordprocessingInk" xmlns:wps="http://schemas.microsoft.com/office/word/2010/wordprocessingShape" xmlns:o="urn:schemas-microsoft-com:office:office" xmlns:v="urn:schemas-microsoft-com:vml" xmlns:w10="urn:schemas-microsoft-com:office:word" xmlns:w="http://schemas.openxmlformats.org/wordprocessingml/2006/main" xmlns:w14="http://schemas.microsoft.com/office/word/2010/wordml" xmlns:w15="http://schemas.microsoft.com/office/word/2012/wordml" xmlns:w16cei="http://schemas.microsoft.com/office/word/2026/wordml/cei" xmlns:w16cex="http://schemas.microsoft.com/office/word/2018/wordml/cex" xmlns:w16cid="http://schemas.microsoft.com/office/word/2016/wordml/cid" xmlns:w16="http://schemas.microsoft.com/office/word/2018/wordml" xmlns:w16sdtdh="http://schemas.microsoft.com/office/word/2020/wordml/sdtdatahash" xmlns:w16sdtfl="http://schemas.microsoft.com/office/word/2024/wordml/sdtformatlock" xmlns:w16se="http://schemas.microsoft.com/office/word/2015/wordml/symex" xmlns:w16du="http://schemas.microsoft.com/office/word/2023/wordml/word16du" xmlns:wne="http://schemas.microsoft.com/office/word/2006/wordml" mc:Ignorable="w14 w15 w16se w16cid w16 w16cex w16sdtdh w16sdtfl w16du wp14">
   <w:body>
     <w:p>
       <w:pPr>
+        <w:tabs>
+          <w:tab w:val="left" w:pos="1691"/>
+        </w:tabs>
         <w:spacing w:after="80"/>
-        <w:jc w:val="center"/>
         <w:rPr>
           <w:noProof/>
           <w:sz w:val="32"/>
@@ -13,11 +15,14 @@
         </w:rPr>
       </w:pPr>
       <w:r>
+        <w:tab/>
+      </w:r>
+      <w:r>
         <w:rPr>
           <w:noProof/>
         </w:rPr>
         <w:drawing>
-          <wp:inline distT="0" distB="0" distL="0" distR="0" wp14:anchorId="6A3F70D8" wp14:editId="45C620D0">
+          <wp:inline distT="0" distB="0" distL="0" distR="0" wp14:anchorId="4AA8127E" wp14:editId="2CDA50DA">
             <wp:extent cx="3711600" cy="989760"/>
             <wp:effectExtent l="0" t="0" r="0" b="1270"/>
             <wp:docPr id="21" name="Obrázek 21"/>
@@ -32,7 +37,7 @@
                     <pic:cNvPicPr/>
                   </pic:nvPicPr>
                   <pic:blipFill>
-                    <a:blip r:embed="rId11">
+                    <a:blip r:embed="rId7">
                       <a:extLst>
                         <a:ext uri="{28A0092B-C50C-407E-A947-70E740481C1C}">
                           <a14:useLocalDpi xmlns:a14="http://schemas.microsoft.com/office/drawing/2010/main" val="0"/>
@@ -115,7 +120,7 @@
           <w:sz w:val="48"/>
           <w:szCs w:val="48"/>
         </w:rPr>
-        <w:footnoteReference w:id="2"/>
+        <w:footnoteReference w:id="1"/>
       </w:r>
     </w:p>
     <w:p>
@@ -129,13 +134,7 @@
         <w:rPr>
           <w:smallCaps/>
         </w:rPr>
-        <w:t>Červenec</w:t>
-      </w:r>
-      <w:r>
-        <w:rPr>
-          <w:smallCaps/>
-        </w:rPr>
-        <w:t xml:space="preserve"> </w:t>
+        <w:t xml:space="preserve">Červenec </w:t>
       </w:r>
       <w:r>
         <w:rPr>
@@ -252,7 +251,7 @@
         </w:rPr>
         <w:t xml:space="preserve">Interaktivní </w:t>
       </w:r>
-      <w:hyperlink r:id="rId12" w:history="1">
+      <w:hyperlink r:id="rId8" w:history="1">
         <w:r>
           <w:rPr>
             <w:rStyle w:val="Hyperlink"/>
@@ -296,7 +295,7 @@
       <w:r>
         <w:t xml:space="preserve"> </w:t>
       </w:r>
-      <w:hyperlink r:id="rId13" w:history="1">
+      <w:hyperlink r:id="rId9" w:history="1">
         <w:r>
           <w:rPr>
             <w:rStyle w:val="Hyperlink"/>
@@ -363,13 +362,7 @@
         <w:t>)</w:t>
       </w:r>
       <w:r>
-        <w:t xml:space="preserve">, </w:t>
-      </w:r>
-      <w:r>
-        <w:t xml:space="preserve">bezpečnostních </w:t>
-      </w:r>
-      <w:r>
-        <w:t>sbor</w:t>
+        <w:t>, bezpečnostních sbor</w:t>
       </w:r>
       <w:r>
         <w:t>ů</w:t>
@@ -387,13 +380,7 @@
         <w:t xml:space="preserve">) jako jsou </w:t>
       </w:r>
       <w:r>
-        <w:t>policie, hasiči, celní správa, vězeňská služba a</w:t>
-      </w:r>
-      <w:r>
-        <w:t> </w:t>
-      </w:r>
-      <w:r>
-        <w:t>v armádě.</w:t>
+        <w:t>policie, hasiči, celní správa, vězeňská služba a v armádě.</w:t>
       </w:r>
     </w:p>
     <w:p>
@@ -404,18 +391,12 @@
           <w:color w:val="2425A9"/>
         </w:rPr>
       </w:pPr>
-      <w:hyperlink r:id="rId14" w:anchor="1a.Po%C4%8Dtyzam%C4%9Bstnanc%C5%AF">
+      <w:hyperlink r:id="rId10" w:anchor="1a.Po%C4%8Dtyzam%C4%9Bstnanc%C5%AF">
         <w:r>
           <w:rPr>
             <w:color w:val="0463C1"/>
           </w:rPr>
-          <w:t xml:space="preserve">Graf 1a. </w:t>
-        </w:r>
-        <w:r>
-          <w:rPr>
-            <w:color w:val="0463C1"/>
-          </w:rPr>
-          <w:t>Počet zaměstnanců státu dle regulace zaměstnanosti</w:t>
+          <w:t>Graf 1a. Počet zaměstnanců státu dle regulace zaměstnanosti</w:t>
         </w:r>
       </w:hyperlink>
     </w:p>
@@ -568,7 +549,7 @@
           <w:szCs w:val="22"/>
         </w:rPr>
       </w:pPr>
-      <w:hyperlink r:id="rId15" w:anchor="10.Zm%C4%9Bnypo%C4%8Dtuzam.podlekategori%C3%AD" w:history="1">
+      <w:hyperlink r:id="rId11" w:anchor="10.Zm%C4%9Bnypo%C4%8Dtuzam.podlekategori%C3%AD" w:history="1">
         <w:r>
           <w:rPr>
             <w:rStyle w:val="Hyperlink"/>
@@ -600,7 +581,7 @@
           <w:numId w:val="32"/>
         </w:numPr>
         <w:spacing w:after="120"/>
-        <w:ind w:left="1426" w:hanging="346"/>
+        <w:ind w:left="1426"/>
         <w:jc w:val="both"/>
       </w:pPr>
       <w:r>
@@ -615,7 +596,7 @@
           <w:numId w:val="32"/>
         </w:numPr>
         <w:spacing w:after="120"/>
-        <w:ind w:left="1426" w:hanging="346"/>
+        <w:ind w:left="1426"/>
         <w:jc w:val="both"/>
       </w:pPr>
       <w:r>
@@ -629,7 +610,7 @@
           <w:numId w:val="32"/>
         </w:numPr>
         <w:spacing w:after="120"/>
-        <w:ind w:left="1426" w:hanging="346"/>
+        <w:ind w:left="1426"/>
         <w:jc w:val="both"/>
       </w:pPr>
       <w:r>
@@ -643,7 +624,7 @@
           <w:numId w:val="32"/>
         </w:numPr>
         <w:spacing w:after="120"/>
-        <w:ind w:left="1426" w:hanging="346"/>
+        <w:ind w:left="1426"/>
         <w:jc w:val="both"/>
       </w:pPr>
       <w:r>
@@ -662,7 +643,7 @@
           <w:ilvl w:val="0"/>
           <w:numId w:val="33"/>
         </w:numPr>
-        <w:ind w:left="591" w:hanging="346"/>
+        <w:ind w:left="591"/>
         <w:jc w:val="both"/>
       </w:pPr>
       <w:r>
@@ -689,7 +670,7 @@
           <w:szCs w:val="22"/>
         </w:rPr>
       </w:pPr>
-      <w:hyperlink r:id="rId16" w:anchor="10.Zm%C4%9Bnypo%C4%8Dtuzam.podlekategori%C3%AD" w:history="1">
+      <w:hyperlink r:id="rId12" w:anchor="10.Zm%C4%9Bnypo%C4%8Dtuzam.podlekategori%C3%AD" w:history="1">
         <w:r>
           <w:rPr>
             <w:rStyle w:val="Hyperlink"/>
@@ -714,7 +695,7 @@
           <w:ilvl w:val="0"/>
           <w:numId w:val="33"/>
         </w:numPr>
-        <w:ind w:left="591" w:hanging="346"/>
+        <w:ind w:left="591"/>
         <w:jc w:val="both"/>
         <w:rPr>
           <w:color w:val="0563C1" w:themeColor="hyperlink"/>
@@ -759,7 +740,7 @@
       <w:pPr>
         <w:pStyle w:val="nospacepara"/>
       </w:pPr>
-      <w:hyperlink r:id="rId17" w:anchor="1a.Po%C4%8Dtyzam%C4%9Bstnanc%C5%AF">
+      <w:hyperlink r:id="rId13" w:anchor="1a.Po%C4%8Dtyzam%C4%9Bstnanc%C5%AF">
         <w:r>
           <w:t>Graf 1a. Počet zaměstnanců státu dle regulace zaměstnanosti</w:t>
         </w:r>
@@ -769,7 +750,7 @@
       <w:pPr>
         <w:pStyle w:val="nospacepara"/>
       </w:pPr>
-      <w:hyperlink r:id="rId18" w:anchor="4a.Po%C4%8Dtyzam%C4%9Bstnanc%C5%AF" w:history="1">
+      <w:hyperlink r:id="rId14" w:anchor="4a.Po%C4%8Dtyzam%C4%9Bstnanc%C5%AF" w:history="1">
         <w:r>
           <w:rPr>
             <w:rStyle w:val="Hyperlink"/>
@@ -784,30 +765,14 @@
       <w:pPr>
         <w:pStyle w:val="nospacepara"/>
       </w:pPr>
-      <w:hyperlink r:id="rId19" w:anchor="4b.Po%C4%8Dtyzam.,v%C4%8Detn%C4%9BMVaMZV" w:history="1">
+      <w:hyperlink r:id="rId15" w:anchor="4b.Po%C4%8Dtyzam.,v%C4%8Detn%C4%9BMVaMZV" w:history="1">
         <w:r>
           <w:rPr>
             <w:rStyle w:val="Hyperlink"/>
             <w:color w:val="auto"/>
             <w:u w:val="none"/>
           </w:rPr>
-          <w:t xml:space="preserve">Graf 4b. Počet státních úředníků 2003–2024, včetně </w:t>
-        </w:r>
-        <w:r>
-          <w:rPr>
-            <w:rStyle w:val="Hyperlink"/>
-            <w:color w:val="auto"/>
-            <w:u w:val="none"/>
-          </w:rPr>
-          <w:t xml:space="preserve">MV a </w:t>
-        </w:r>
-        <w:r>
-          <w:rPr>
-            <w:rStyle w:val="Hyperlink"/>
-            <w:color w:val="auto"/>
-            <w:u w:val="none"/>
-          </w:rPr>
-          <w:t>MZV</w:t>
+          <w:t>Graf 4b. Počet státních úředníků 2003–2024, včetně MV a MZV</w:t>
         </w:r>
       </w:hyperlink>
     </w:p>
@@ -817,7 +782,7 @@
           <w:ilvl w:val="0"/>
           <w:numId w:val="33"/>
         </w:numPr>
-        <w:ind w:left="591" w:hanging="346"/>
+        <w:ind w:left="591"/>
         <w:jc w:val="both"/>
       </w:pPr>
       <w:r>
@@ -841,7 +806,7 @@
       <w:pPr>
         <w:pStyle w:val="nospacepara"/>
       </w:pPr>
-      <w:hyperlink r:id="rId20" w:anchor="4b.Po%C4%8Dtyzam.,v%C4%8Detn%C4%9BMVaMZV" w:history="1">
+      <w:hyperlink r:id="rId16" w:anchor="4b.Po%C4%8Dtyzam.,v%C4%8Detn%C4%9BMVaMZV" w:history="1">
         <w:r>
           <w:rPr>
             <w:rStyle w:val="Hyperlink"/>
@@ -871,7 +836,7 @@
           <w:ilvl w:val="0"/>
           <w:numId w:val="32"/>
         </w:numPr>
-        <w:ind w:left="591" w:hanging="346"/>
+        <w:ind w:left="591"/>
         <w:jc w:val="both"/>
       </w:pPr>
       <w:r>
@@ -902,7 +867,7 @@
       <w:pPr>
         <w:pStyle w:val="nospacepara"/>
       </w:pPr>
-      <w:hyperlink r:id="rId21" w:anchor="9a.Po%C4%8Detzam.ve%C5%99.sektoru" w:history="1">
+      <w:hyperlink r:id="rId17" w:anchor="9a.Po%C4%8Detzam.ve%C5%99.sektoru" w:history="1">
         <w:r>
           <w:rPr>
             <w:rStyle w:val="Hyperlink"/>
@@ -937,7 +902,7 @@
           <w:ilvl w:val="0"/>
           <w:numId w:val="32"/>
         </w:numPr>
-        <w:ind w:left="591" w:hanging="346"/>
+        <w:ind w:left="591"/>
         <w:jc w:val="both"/>
       </w:pPr>
       <w:r>
@@ -977,10 +942,7 @@
         <w:t>pátý</w:t>
       </w:r>
       <w:r>
-        <w:t xml:space="preserve"> </w:t>
-      </w:r>
-      <w:r>
-        <w:t xml:space="preserve">rok v řadě. Platy úředníků ministerstev tak </w:t>
+        <w:t xml:space="preserve"> rok v řadě. Platy úředníků ministerstev tak </w:t>
       </w:r>
       <w:proofErr w:type="spellStart"/>
       <w:r>
@@ -1013,7 +975,7 @@
       <w:pPr>
         <w:pStyle w:val="nospacepara"/>
       </w:pPr>
-      <w:hyperlink r:id="rId22" w:anchor="5a.Vre%C3%A1ln%C3%A9mvyj%C3%A1d%C5%99en%C3%AD" w:history="1">
+      <w:hyperlink r:id="rId18" w:anchor="5a.Vre%C3%A1ln%C3%A9mvyj%C3%A1d%C5%99en%C3%AD" w:history="1">
         <w:r>
           <w:rPr>
             <w:rStyle w:val="Hyperlink"/>
@@ -1029,7 +991,7 @@
           <w:ilvl w:val="0"/>
           <w:numId w:val="32"/>
         </w:numPr>
-        <w:ind w:left="591" w:hanging="346"/>
+        <w:ind w:left="591"/>
         <w:jc w:val="both"/>
       </w:pPr>
       <w:r>
@@ -1048,10 +1010,7 @@
         <w:t>ekonomice, se poslední dvě dekády vyvíjely velmi cyklicky. Minima dosáhly v letech 2011</w:t>
       </w:r>
       <w:r>
-        <w:t>–</w:t>
-      </w:r>
-      <w:r>
-        <w:t>‍</w:t>
+        <w:t>–‍</w:t>
       </w:r>
       <w:r>
         <w:t>2012, maxima kolem roku 2018 a od té doby klesají. Rok 2024 byl pro ministers</w:t>
@@ -1100,7 +1059,7 @@
       <w:pPr>
         <w:ind w:left="346" w:firstLine="245"/>
       </w:pPr>
-      <w:hyperlink r:id="rId23" w:anchor="5b.V%C5%AF%C4%8Dipr%C5%AFm%C4%9Brn%C3%A9mzd%C4%9B" w:history="1">
+      <w:hyperlink r:id="rId19" w:anchor="5b.V%C5%AF%C4%8Dipr%C5%AFm%C4%9Brn%C3%A9mzd%C4%9B" w:history="1">
         <w:r>
           <w:rPr>
             <w:rStyle w:val="Hyperlink"/>
@@ -1116,7 +1075,7 @@
           <w:ilvl w:val="0"/>
           <w:numId w:val="32"/>
         </w:numPr>
-        <w:ind w:left="591" w:hanging="346"/>
+        <w:ind w:left="591"/>
         <w:jc w:val="both"/>
       </w:pPr>
       <w:r>
@@ -1145,7 +1104,7 @@
       <w:pPr>
         <w:ind w:left="346" w:firstLine="245"/>
       </w:pPr>
-      <w:hyperlink r:id="rId24" w:anchor="5a.Vre%C3%A1ln%C3%A9mvyj%C3%A1d%C5%99en%C3%AD" w:history="1">
+      <w:hyperlink r:id="rId20" w:anchor="5a.Vre%C3%A1ln%C3%A9mvyj%C3%A1d%C5%99en%C3%AD" w:history="1">
         <w:r>
           <w:rPr>
             <w:rStyle w:val="Hyperlink"/>
@@ -1161,7 +1120,7 @@
           <w:ilvl w:val="0"/>
           <w:numId w:val="33"/>
         </w:numPr>
-        <w:ind w:left="591" w:hanging="346"/>
+        <w:ind w:left="591"/>
         <w:jc w:val="both"/>
       </w:pPr>
       <w:r>
@@ -1194,7 +1153,7 @@
       <w:r>
         <w:t xml:space="preserve"> pohlaví a regionu nabízí </w:t>
       </w:r>
-      <w:hyperlink r:id="rId25" w:history="1">
+      <w:hyperlink r:id="rId21" w:history="1">
         <w:r>
           <w:rPr>
             <w:rStyle w:val="Hyperlink"/>
@@ -1212,7 +1171,7 @@
         <w:ind w:left="590"/>
         <w:jc w:val="both"/>
       </w:pPr>
-      <w:hyperlink r:id="rId26" w:anchor="3a.Absolutn%C3%ADhodnoty" w:history="1">
+      <w:hyperlink r:id="rId22" w:anchor="3a.Absolutn%C3%ADhodnoty" w:history="1">
         <w:r>
           <w:rPr>
             <w:rStyle w:val="Hyperlink"/>
@@ -1244,7 +1203,7 @@
           <w:ilvl w:val="0"/>
           <w:numId w:val="33"/>
         </w:numPr>
-        <w:ind w:left="591" w:hanging="346"/>
+        <w:ind w:left="591"/>
         <w:jc w:val="both"/>
       </w:pPr>
       <w:r>
@@ -1272,7 +1231,7 @@
           <w:u w:val="none"/>
         </w:rPr>
       </w:pPr>
-      <w:hyperlink r:id="rId27" w:anchor="3a.Absolutn%C3%ADhodnoty" w:history="1">
+      <w:hyperlink r:id="rId23" w:anchor="3a.Absolutn%C3%ADhodnoty" w:history="1">
         <w:r>
           <w:rPr>
             <w:rStyle w:val="Hyperlink"/>
@@ -1307,7 +1266,7 @@
           <w:ilvl w:val="0"/>
           <w:numId w:val="34"/>
         </w:numPr>
-        <w:ind w:left="591" w:hanging="346"/>
+        <w:ind w:left="591"/>
         <w:jc w:val="both"/>
       </w:pPr>
       <w:r>
@@ -1334,20 +1293,13 @@
           <w:u w:val="none"/>
         </w:rPr>
       </w:pPr>
-      <w:hyperlink r:id="rId28" w:anchor="3a.Absolutn%C3%ADhodnoty" w:history="1">
+      <w:hyperlink r:id="rId24" w:anchor="3a.Absolutn%C3%ADhodnoty" w:history="1">
         <w:r>
           <w:rPr>
             <w:rStyle w:val="Hyperlink"/>
             <w:u w:val="none"/>
           </w:rPr>
-          <w:t xml:space="preserve">Graf 3a. Průměrné platy zaměstnanců státu </w:t>
-        </w:r>
-        <w:r>
-          <w:rPr>
-            <w:rStyle w:val="Hyperlink"/>
-            <w:u w:val="none"/>
-          </w:rPr>
-          <w:t xml:space="preserve">dle </w:t>
+          <w:t xml:space="preserve">Graf 3a. Průměrné platy zaměstnanců státu dle </w:t>
         </w:r>
         <w:proofErr w:type="spellStart"/>
         <w:r>
@@ -1392,7 +1344,7 @@
           <w:ilvl w:val="0"/>
           <w:numId w:val="33"/>
         </w:numPr>
-        <w:ind w:left="591" w:hanging="346"/>
+        <w:ind w:left="591"/>
         <w:jc w:val="both"/>
       </w:pPr>
       <w:r>
@@ -1417,7 +1369,7 @@
         <w:ind w:left="590"/>
         <w:jc w:val="both"/>
       </w:pPr>
-      <w:hyperlink r:id="rId29" w:anchor="1b.V%C3%BDdajenaplaty" w:history="1">
+      <w:hyperlink r:id="rId25" w:anchor="1b.V%C3%BDdajenaplaty" w:history="1">
         <w:r>
           <w:rPr>
             <w:rStyle w:val="Hyperlink"/>
@@ -1433,7 +1385,7 @@
           <w:ilvl w:val="0"/>
           <w:numId w:val="33"/>
         </w:numPr>
-        <w:ind w:left="591" w:hanging="346"/>
+        <w:ind w:left="591"/>
         <w:jc w:val="both"/>
       </w:pPr>
       <w:r>
@@ -1469,7 +1421,7 @@
         <w:spacing w:after="200"/>
         <w:ind w:left="86" w:firstLine="504"/>
       </w:pPr>
-      <w:hyperlink r:id="rId30" w:anchor="1b.V%C3%BDdajenaplaty" w:history="1">
+      <w:hyperlink r:id="rId26" w:anchor="1b.V%C3%BDdajenaplaty" w:history="1">
         <w:r>
           <w:rPr>
             <w:rStyle w:val="Hyperlink"/>
@@ -1486,7 +1438,7 @@
           <w:ilvl w:val="0"/>
           <w:numId w:val="33"/>
         </w:numPr>
-        <w:ind w:left="591" w:hanging="346"/>
+        <w:ind w:left="591"/>
         <w:jc w:val="both"/>
       </w:pPr>
       <w:r>
@@ -1504,7 +1456,7 @@
         <w:ind w:left="590"/>
         <w:jc w:val="both"/>
       </w:pPr>
-      <w:hyperlink r:id="rId31" w:anchor="4c.V%C3%BDdajenaplaty" w:history="1">
+      <w:hyperlink r:id="rId27" w:anchor="4c.V%C3%BDdajenaplaty" w:history="1">
         <w:r>
           <w:rPr>
             <w:rStyle w:val="Hyperlink"/>
@@ -1520,7 +1472,7 @@
           <w:ilvl w:val="0"/>
           <w:numId w:val="34"/>
         </w:numPr>
-        <w:ind w:left="591" w:hanging="346"/>
+        <w:ind w:left="591"/>
         <w:jc w:val="both"/>
       </w:pPr>
       <w:r>
@@ -1544,7 +1496,7 @@
         <w:ind w:left="591"/>
         <w:jc w:val="both"/>
       </w:pPr>
-      <w:hyperlink r:id="rId32" w:anchor="5a.Vre%C3%A1ln%C3%A9mvyj%C3%A1d%C5%99en%C3%AD" w:history="1">
+      <w:hyperlink r:id="rId28" w:anchor="5a.Vre%C3%A1ln%C3%A9mvyj%C3%A1d%C5%99en%C3%AD" w:history="1">
         <w:r>
           <w:rPr>
             <w:rStyle w:val="Hyperlink"/>
@@ -1554,11 +1506,768 @@
         </w:r>
       </w:hyperlink>
     </w:p>
+    <w:p>
+      <w:pPr>
+        <w:spacing w:before="0" w:after="160" w:line="259" w:lineRule="auto"/>
+        <w:rPr>
+          <w:sz w:val="48"/>
+          <w:szCs w:val="48"/>
+        </w:rPr>
+      </w:pPr>
+    </w:p>
+    <w:p>
+      <w:pPr>
+        <w:pStyle w:val="Title"/>
+      </w:pPr>
+      <w:r>
+        <w:t>Zaměstnanci státu a státní úředníci 2025: Data a metodologie</w:t>
+      </w:r>
+    </w:p>
+    <w:p>
+      <w:pPr>
+        <w:pStyle w:val="FirstParagraph"/>
+      </w:pPr>
+      <w:r>
+        <w:t>V této příloze popisujeme datové zdroje a detaily našeho metodologického přístupu. Nejdříve popisujeme hlavní zdroj dat a jak se člení dle regulace zaměstnanosti nebo rozpočtových kapitol.</w:t>
+      </w:r>
+    </w:p>
+    <w:p>
+      <w:pPr>
+        <w:pStyle w:val="BodyText"/>
+      </w:pPr>
+      <w:r>
+        <w:t>Následují tři metodologické poznámky k našemu využití těchto dat:</w:t>
+      </w:r>
+    </w:p>
+    <w:p>
+      <w:pPr>
+        <w:pStyle w:val="Compact"/>
+      </w:pPr>
+      <w:r>
+        <w:t>jak je upravujeme pro analýzu časových řad</w:t>
+      </w:r>
+    </w:p>
+    <w:p>
+      <w:pPr>
+        <w:pStyle w:val="Compact"/>
+      </w:pPr>
+      <w:r>
+        <w:lastRenderedPageBreak/>
+        <w:t>co přesně znamenají výdaje na platy obsažené v datech</w:t>
+      </w:r>
+    </w:p>
+    <w:p>
+      <w:pPr>
+        <w:pStyle w:val="Compact"/>
+      </w:pPr>
+      <w:r>
+        <w:t>jak se liší využití termínu „zaměstnanci státu” v naší studii od kategorie „státní zaměstnanci” v zákoně o státní službě.</w:t>
+      </w:r>
+    </w:p>
+    <w:p>
+      <w:pPr>
+        <w:pStyle w:val="BodyText"/>
+      </w:pPr>
+      <w:r>
+        <w:t xml:space="preserve">Pokračujeme pak </w:t>
+      </w:r>
+      <w:proofErr w:type="gramStart"/>
+      <w:r>
+        <w:t>diskuzí</w:t>
+      </w:r>
+      <w:proofErr w:type="gramEnd"/>
+      <w:r>
+        <w:t xml:space="preserve"> dalších dat (o mzdách, inflaci a zaměstnancích veřejného sektoru), která všechna získáváme od Českého statistického úřadu. Závěrem této přílohy stručně popisujeme, že pro analýzu v této studii využíváme programovací jazyk R, určený ke statistické analýze dat.</w:t>
+      </w:r>
+    </w:p>
+    <w:p>
+      <w:pPr>
+        <w:pStyle w:val="Heading1"/>
+      </w:pPr>
+      <w:bookmarkStart w:id="2" w:name="hlavní-zdroj-dat"/>
+      <w:r>
+        <w:t>Hlavní zdroj dat</w:t>
+      </w:r>
+    </w:p>
+    <w:p>
+      <w:pPr>
+        <w:pStyle w:val="FirstParagraph"/>
+      </w:pPr>
+      <w:r>
+        <w:t xml:space="preserve">Hlavním zdrojem této studie jsou data poskytovaná Ministerstvem financí ze </w:t>
+      </w:r>
+      <w:hyperlink r:id="rId29">
+        <w:r>
+          <w:rPr>
+            <w:rStyle w:val="Hyperlink"/>
+          </w:rPr>
+          <w:t>státních závěrečných účtů</w:t>
+        </w:r>
+      </w:hyperlink>
+      <w:r>
+        <w:t>. Jedná se o data, která odpovídají státnímu výkaznictví zaměstnanců a výdajů na platy hrazených ze státního rozpočtů a tím i rozpočtové skladbě obecně (viz níže). Ministerstvo financí předkládá vždy do konce dubna Státní závěrečný účet za předešlý rok Poslanecké sněmovně, která jej bere na vědomí. Státní závěrečný účet obsahuje údaje o výsledcích rozpočtového hospodaření minulého roku. V datech jsou počty i platy přepočtené na plné úvazky.</w:t>
+      </w:r>
+    </w:p>
+    <w:p>
+      <w:pPr>
+        <w:pStyle w:val="BodyText"/>
+      </w:pPr>
+      <w:r>
+        <w:t>Veřejně dostupná verze Státního závěrečného účtu ale v Sešitu G, tabulce 10 a 11 neobsahuje údaj o výdajích na platy, ale pouze o výdajích na platy a další provedené práce. Nelze z nich tedy vypočíst průměrný plat, proto v této studii vycházíme z tabulek poskytnutých Ministerstvem financí.</w:t>
+      </w:r>
+    </w:p>
+    <w:p>
+      <w:pPr>
+        <w:pStyle w:val="BodyText"/>
+      </w:pPr>
+      <w:r>
+        <w:t>Pracujeme především se skutečnými výdaji, a tedy i s reálně obsazenými zaměstnaneckými místy. Výjimkou je analýza tzv. neobsazených míst, pro jejíž účely porovnáváme schválený rozpočet se skutečností. Neobsazená místa ukazujeme v Grafech 7a a 7b a podobným způsobem porovnáváme rozdíly v průměrných platech mezi schváleným rozpočtem a skutečností v Grafech 7c a 7d.</w:t>
+      </w:r>
+    </w:p>
+    <w:p>
+      <w:pPr>
+        <w:pStyle w:val="BodyText"/>
+      </w:pPr>
+      <w:r>
+        <w:t>Zaměstnance státu pro účely této studie definujeme jako ty, placené ze státního rozpočtu. Můžeme je členit dle regulace zaměstnanosti nebo dle rozpočtových kapitol.</w:t>
+      </w:r>
+    </w:p>
+    <w:p>
+      <w:pPr>
+        <w:pStyle w:val="BodyText"/>
+      </w:pPr>
+      <w:r>
+        <w:t>Tato členění shrnujeme níže.</w:t>
+      </w:r>
+    </w:p>
+    <w:p>
+      <w:pPr>
+        <w:pStyle w:val="Heading2"/>
+      </w:pPr>
+      <w:bookmarkStart w:id="3" w:name="regulace-zaměstnanosti"/>
+      <w:r>
+        <w:t>Regulace zaměstnanosti</w:t>
+      </w:r>
+    </w:p>
+    <w:p>
+      <w:pPr>
+        <w:pStyle w:val="FirstParagraph"/>
+      </w:pPr>
+      <w:r>
+        <w:t>Zaměstnanci státu jsou podle tzv. regulace zaměstnanosti, kterou využívá Ministerstvo financí pro data o státních zaměstnancích, rozděleni do šesti skupin. Ministerstva (1. skupina) a ostatní ústřední úřady (2. skupina) spolu dávají ústřední orgány státní správy. Kategorii ústředních orgánů jsme na ministerstva a jiné rozdělili, přestože toto dělení ve vstupních datech Ministerstva financí není. Když k nim přidáme neústřední státní správu (3. skupina) a správu ve složkách obrany, bezpečnostní, celní a právní ochrany (4. skupina), mluvíme dohromady o státní správě. Když k nim dále přidáme ostatní organizační složky státu (5. skupina), včetně Armády ČR, máme organizační složky státu nebo také rozpočtové organizace. Konečně, přidáním příspěvkových organizací (6. skupina), získáváme rozpočtové organizace a příspěvkové organizace, které souhrnně označujeme jako státní zaměstnance.</w:t>
+      </w:r>
+    </w:p>
+    <w:p>
+      <w:pPr>
+        <w:pStyle w:val="BodyText"/>
+      </w:pPr>
+      <w:r>
+        <w:t xml:space="preserve">Zaměstnanci ve školství jsou sice vesměs zaměstnanci škol zřizovaných samosprávami, v rozpočtové dokumentaci jsou ale vedeni jako zaměstnanci příspěvkových organizací v kapitole </w:t>
+      </w:r>
+      <w:r>
+        <w:lastRenderedPageBreak/>
+        <w:t>Ministerstva školství, mládeže a tělovýchovy, protože peníze na jejich platy obce dostávají ze státního rozpočtu ve výši stanovené legislativou na centrální úrovni.</w:t>
+      </w:r>
+    </w:p>
+    <w:p>
+      <w:pPr>
+        <w:pStyle w:val="Heading2"/>
+      </w:pPr>
+      <w:bookmarkStart w:id="4" w:name="rozpočtové-kapitoly"/>
+      <w:bookmarkEnd w:id="3"/>
+      <w:r>
+        <w:t>Rozpočtové kapitoly</w:t>
+      </w:r>
+    </w:p>
+    <w:p>
+      <w:pPr>
+        <w:pStyle w:val="FirstParagraph"/>
+      </w:pPr>
+      <w:r>
+        <w:t>Počty zaměstnanců je možné uvádět dle rozpočtových kapitol, do nichž se člení výdaje státního rozpočtu, a tedy výdaje které spadají do působnosti jednoho z ústředních orgánů státní správy. Z jedné rozpočtové kapitoly mohou být placeny zaměstnanci lišící se dle regulace zaměstnanosti. Například Ministerstvo vnitra má velké množství zaměstnanců ve sborech a ústředních orgánech státní správy, ale také nezanedbatelné množství v organizačních složkách státu a ostatních organizačních složkách státu. Většina kapitol má zaměstnance jen v jedné kategorii – například Český statistický úřad sestává pouze z ústředních orgánů státní správy.</w:t>
+      </w:r>
+      <w:r>
+        <w:br/>
+        <w:t>Rozpočtové kapitoly a jejich zkratky uvádíme v tabulce, jelikož v některých grafech tyto zkratky využíváme.</w:t>
+      </w:r>
+    </w:p>
+    <w:p>
+      <w:pPr>
+        <w:pStyle w:val="BodyText"/>
+      </w:pPr>
+      <w:r>
+        <w:t>Zvláštní pozornost zasluhují následující kapitoly:</w:t>
+      </w:r>
+    </w:p>
+    <w:p>
+      <w:pPr>
+        <w:pStyle w:val="Compact"/>
+      </w:pPr>
+      <w:r>
+        <w:t>Ministerstvo vnitra, jehož ústřední orgán (uvádíme v kategorii „Ministerstva”) zahrnuje všechny zaměstnance vyplácené pod IČO MV, tj. i civilní zaměstnance Policejního prezidia, Generálního ředitelství Hasičského záchranného sboru a civilních zaměstnanců celostátních složek Policie ČR. Ve výdajích na platy příslušníků bezpečnostních sborů v této kapitoly také nejsou zahrnuty složky příjmů, které nejsou právně definovány součást služebního příjmu, přestože jsou součástí měsíční výplaty příslušníka – např. kázeňské odměny. Tyto složky se pak také neodráží ve vykazovaných průměrných platech příslušníků. Také zde nejsou vykázány výdaje na výsluhové náležitosti.</w:t>
+      </w:r>
+    </w:p>
+    <w:p>
+      <w:pPr>
+        <w:pStyle w:val="Compact"/>
+      </w:pPr>
+      <w:r>
+        <w:t>V kapitole Ministerstva obrany jsou zahrnuti civilní zaměstnanci i vojáci Armády ČR. Ve výdajích na platy vojáků pak nejsou zahrnuty výdaje, které nehradí právně definovaný plat vojáka, např. kázeňské odměny a stabilizační příplatky. Ty mohou výrazně ovlivnit příjmy vojáků, ale v průměrných platech vykazovaných v SZÚ to není odraženo. Také zde nejsou vykázány výdaje na výsluhové náležitosti. V platech vojáků nejsou zahrnuty náhrady na zvýšené životní náklady při vyslání do zahraničí, které výrazně zvyšují skutečné příjmy vyslaných vojáků.</w:t>
+      </w:r>
+    </w:p>
+    <w:p>
+      <w:pPr>
+        <w:pStyle w:val="Compact"/>
+      </w:pPr>
+      <w:r>
+        <w:t>V kapitole MZV jsou zahrnuti všichni zaměstnanci v zahraniční službě, tj. i čeští zaměstnanci ambasád. V jejich platech nejsou zahrnuty náhrady na zvýšené životní náklady při vyslání do zahraničí, které výrazně zvyšují skutečné příjmy těchto zaměstnanců.</w:t>
+      </w:r>
+    </w:p>
+    <w:p>
+      <w:pPr>
+        <w:pStyle w:val="Heading2"/>
+      </w:pPr>
+      <w:bookmarkStart w:id="5" w:name="úprava-pro-časové-řady"/>
+      <w:bookmarkEnd w:id="4"/>
+      <w:r>
+        <w:t>Úprava pro časové řady</w:t>
+      </w:r>
+    </w:p>
+    <w:p>
+      <w:pPr>
+        <w:pStyle w:val="FirstParagraph"/>
+      </w:pPr>
+      <w:r>
+        <w:t>Pro časové řady, kde se počítá s absolutními metrikami (počty zaměstnanců, prostředky na platy), jsme odebrali kapitoly Ministerstev vnitra a zahraničních věcí, aby byly výsledky srovnatelné v čase.</w:t>
+      </w:r>
+    </w:p>
+    <w:p>
+      <w:pPr>
+        <w:pStyle w:val="BodyText"/>
+      </w:pPr>
+      <w:r>
+        <w:t>Počty zaměstnanců pro kapitolu Ministerstva vnitra se mezi roky 2011 a 2012 zvýšily vzhledem ke změně organizační struktury o 321 % a pro kapitolu Ministerstva zahraničí je to pak 157 %. Ponecháním těchto kapitol v grafech časových řad by došlo ke značnému zkreslení zejména Grafu 4e. Kumulovaná změna reálných výdajů na platy státních úředníků.</w:t>
+      </w:r>
+    </w:p>
+    <w:p>
+      <w:pPr>
+        <w:pStyle w:val="Heading3"/>
+      </w:pPr>
+      <w:bookmarkStart w:id="6" w:name="X8f397794ad90049e61a834dc4df4cb8439d8303"/>
+      <w:r>
+        <w:t>Celkové reálné změny platů a počtu zaměstnanců</w:t>
+      </w:r>
+    </w:p>
+    <w:p>
+      <w:pPr>
+        <w:pStyle w:val="FirstParagraph"/>
+      </w:pPr>
+      <w:r>
+        <w:t>Graf 4a ukazuje vývoj počtu státních úředníků se zahrnutím ministerstev vnitra a zahraničních věcí. U časových řad průměrných platů jsme ministerstva vnitra a zahraničních věcí nechali zahrnutá, i když i u nich může dojít k mírnému zkreslení (například pokud došlo k přesunu zaměstnanců s vysokými platy).</w:t>
+      </w:r>
+    </w:p>
+    <w:p>
+      <w:pPr>
+        <w:pStyle w:val="BodyText"/>
+      </w:pPr>
+      <w:r>
+        <w:lastRenderedPageBreak/>
+        <w:t>Podobně jako u těchto dvou ministerstev mohlo dojít k výrazným změnám v počtech zaměstnanců kvůli změnám organizačních struktur, o kterých nevíme.</w:t>
+      </w:r>
+    </w:p>
+    <w:p>
+      <w:pPr>
+        <w:pStyle w:val="BodyText"/>
+      </w:pPr>
+      <w:r>
+        <w:t>Zároveň upozorňujeme, že pohyby v časových řadách mohou být způsobené i přesuny agend a útvarů mezi úřady, které v analýze nemůžeme zohlednit.</w:t>
+      </w:r>
+    </w:p>
+    <w:p>
+      <w:pPr>
+        <w:pStyle w:val="BodyText"/>
+      </w:pPr>
+      <w:r>
+        <w:t>Podobné změny nejsou konzistentně a veřejně dokumentovány.</w:t>
+      </w:r>
+    </w:p>
+    <w:p>
+      <w:pPr>
+        <w:pStyle w:val="Heading2"/>
+      </w:pPr>
+      <w:bookmarkStart w:id="7" w:name="výdaje-na-platy"/>
+      <w:bookmarkEnd w:id="5"/>
+      <w:bookmarkEnd w:id="6"/>
+      <w:r>
+        <w:t>Výdaje na platy</w:t>
+      </w:r>
+    </w:p>
+    <w:p>
+      <w:pPr>
+        <w:pStyle w:val="FirstParagraph"/>
+      </w:pPr>
+      <w:r>
+        <w:t>Pracujeme pouze s výdaji na platy, nezahrnujeme tzv. ostatní platby za provedenou práci, které zahrnují např. odměny pracovníků zaměstnaných na dohody o provedení práce. Tato data sice v datové sadě jsou, není je ale možné vztáhnout k počtům těchto osob, které sledovány nejsou.</w:t>
+      </w:r>
+    </w:p>
+    <w:p>
+      <w:pPr>
+        <w:pStyle w:val="BodyText"/>
+      </w:pPr>
+      <w:r>
+        <w:t>Stejně tak naše data nezahrnují odvody zaměstnavatele a další náklady na zaměstnance, takže jde opravdu o hrubé platy, nikoli o náklady práce.</w:t>
+      </w:r>
+    </w:p>
+    <w:p>
+      <w:pPr>
+        <w:pStyle w:val="BodyText"/>
+      </w:pPr>
+      <w:r>
+        <w:t>Ve vztahu k platům zaměstnanců škol (příspěvkové organizace v kapitole Ministerstva školství, mládeže a tělovýchovy) také platí, že skutečné platy těchto zaměstnanců mohou být jiné, např. protože na ně z vlastních zdrojů přispívá samospráva, která zřizuje školy. Máme za to, že pokud například některé obce doplácejí na platy svých učitelů, výsledný vyšší průměrný plat (ani dodatečné výdaje na platy) není zahrnut v datech, která využíváme, protože nejde o výdaj státního rozpočtu.</w:t>
+      </w:r>
+    </w:p>
+    <w:p>
+      <w:pPr>
+        <w:pStyle w:val="BodyText"/>
+      </w:pPr>
+      <w:r>
+        <w:t>A konečně pracujeme pouze s platy zaměstnanců, kteří podléhají rozpočtové regulaci a jako takové je stát sleduje, tj. nejde o veškeré platy hrazené z prostředků státního rozpočtu (nejsou zde např. platy vysokoškolských učitelů či zaměstnanců organizací, které jsou např. příjemci dotací, prostředků na výzkum a vývoj či dodavateli veřejných zakázek.) Naopak zde jsou zahrnuty výdaje platy, které sice hradí státní rozpočet, ale jsou kryty rozpočtem evropským – jde např. o platy státních zaměstnanců pracujících na projektech hrazených z evropských strukturálních a investičních fondů, kde je příjemcem stát.</w:t>
+      </w:r>
+    </w:p>
+    <w:p>
+      <w:pPr>
+        <w:pStyle w:val="Heading2"/>
+      </w:pPr>
+      <w:bookmarkStart w:id="8" w:name="X0b582b47decbd6a7ddf1171f9fffb34b70c8b95"/>
+      <w:bookmarkEnd w:id="7"/>
+      <w:r>
+        <w:t>„Státní zaměstnanci“ a zákon o státní službě</w:t>
+      </w:r>
+    </w:p>
+    <w:p>
+      <w:pPr>
+        <w:pStyle w:val="FirstParagraph"/>
+      </w:pPr>
+      <w:r>
+        <w:t>Pracujeme s pojmem „zaměstnanci státu”, abychom jej odlišili od spojení „státní zaměstnanec”, se kterým pracuje zákon o státní službě, který jím označuje zaměstnance ve služebním poměru. Ve služebních úřadech ale pracují i zaměstnanci v běžném zaměstnaneckém poměru. V datech, se kterými pracujeme, nejsou zaměstnanci ve služebním poměru zvlášť sledováni. Proto v této studii jako zaměstnance státu označujeme všechny, kteří spadají do výše zmíněných kategorií regulace zaměstnanosti.</w:t>
+      </w:r>
+    </w:p>
+    <w:p>
+      <w:pPr>
+        <w:pStyle w:val="BodyText"/>
+      </w:pPr>
+      <w:r>
+        <w:t xml:space="preserve">Část informací o zaměstnancích ve služebním poměru poskytuje Monitor Státní pokladny (výdaje na platy zaměstnanců ve služebním poměru podle příslušné položky druhového členění, ale bez informací o počtech a průměrných platech), další informace pak obsahuje i </w:t>
+      </w:r>
+      <w:hyperlink r:id="rId30">
+        <w:r>
+          <w:rPr>
+            <w:rStyle w:val="Hyperlink"/>
+          </w:rPr>
+          <w:t>Výroční zpráva o státní službě</w:t>
+        </w:r>
+      </w:hyperlink>
+      <w:r>
+        <w:t>.</w:t>
+      </w:r>
+    </w:p>
+    <w:p>
+      <w:pPr>
+        <w:pStyle w:val="Heading1"/>
+      </w:pPr>
+      <w:bookmarkStart w:id="9" w:name="data-o-mzdách-v-ekonomice-a-inflaci"/>
+      <w:bookmarkEnd w:id="2"/>
+      <w:bookmarkEnd w:id="8"/>
+      <w:r>
+        <w:t>Data o mzdách v ekonomice a inflaci</w:t>
+      </w:r>
+    </w:p>
+    <w:p>
+      <w:pPr>
+        <w:pStyle w:val="FirstParagraph"/>
+      </w:pPr>
+      <w:r>
+        <w:t xml:space="preserve">Dodatečná data používáme od Českého statistického úřadu o mzdách v ekonomice a inflaci. Při porovnávání platů používáme průměrnou pražskou mzdu pro ústřední orgány a průměrnou celorepublikovou mzdu pro ostatní, vše z datové sady ČSÚ </w:t>
+      </w:r>
+      <w:hyperlink r:id="rId31">
+        <w:r>
+          <w:rPr>
+            <w:rStyle w:val="Hyperlink"/>
+          </w:rPr>
+          <w:t xml:space="preserve">Průměrná hrubá měsíční mzda a </w:t>
+        </w:r>
+        <w:r>
+          <w:rPr>
+            <w:rStyle w:val="Hyperlink"/>
+          </w:rPr>
+          <w:lastRenderedPageBreak/>
+          <w:t>medián mezd v krajích</w:t>
+        </w:r>
+      </w:hyperlink>
+      <w:r>
+        <w:t xml:space="preserve"> (kód 110080) od roku 2011, dřívější roky z dalších srovnatelných tabulek z produkce ČSÚ. Pro srovnatelnost s rozpočtovými daty používáme průměr (nikoli medián) mezd. Pro údaje o cenových hladinách a inflaci (například pro výpočet reálného průměrného hrubé měsíčního platu) používáme </w:t>
+      </w:r>
+      <w:hyperlink r:id="rId32">
+        <w:r>
+          <w:rPr>
+            <w:rStyle w:val="Hyperlink"/>
+          </w:rPr>
+          <w:t>datovou sadu ČSÚ s indexy spotřebitelských cen</w:t>
+        </w:r>
+      </w:hyperlink>
+      <w:r>
+        <w:t xml:space="preserve"> (kód 010022).</w:t>
+      </w:r>
+    </w:p>
+    <w:p>
+      <w:pPr>
+        <w:pStyle w:val="Heading1"/>
+      </w:pPr>
+      <w:bookmarkStart w:id="10" w:name="X7589a058fb60e437c9db9f9c8efbb2de208f48c"/>
+      <w:bookmarkEnd w:id="9"/>
+      <w:r>
+        <w:t>Data o počtech zaměstnanců veřejného sektoru</w:t>
+      </w:r>
+    </w:p>
+    <w:p>
+      <w:pPr>
+        <w:pStyle w:val="FirstParagraph"/>
+      </w:pPr>
+      <w:r>
+        <w:t xml:space="preserve">Nejlepší data o státních zaměstnancích od Ministerstva financí využíváme v této studii, ale pro celou množinu zaměstnanců veřejného sektoru poskytují jediné systematické údaje </w:t>
+      </w:r>
+      <w:hyperlink r:id="rId33">
+        <w:r>
+          <w:rPr>
+            <w:rStyle w:val="Hyperlink"/>
+          </w:rPr>
+          <w:t>Statistické ročenky Českého statistického úřadu</w:t>
+        </w:r>
+      </w:hyperlink>
+      <w:r>
+        <w:t xml:space="preserve"> pro jednotlivé roky. Pro tyto účely je veřejný sektor velmi široce definován a zahrnuje, kromě státních zaměstnanců, například obce a kraje nebo i veřejné finanční i nefinanční firmy. Podle tohoto zdroje veřejný sektor celkem v posledních letech zaměstnával přes 1 milion zaměstnanců (přepočtených na plné úvazky).</w:t>
+      </w:r>
+    </w:p>
+    <w:p>
+      <w:pPr>
+        <w:pStyle w:val="Heading1"/>
+      </w:pPr>
+      <w:bookmarkStart w:id="11" w:name="technika-analýzy-dat"/>
+      <w:bookmarkEnd w:id="10"/>
+      <w:r>
+        <w:t>Technika analýzy dat</w:t>
+      </w:r>
+    </w:p>
+    <w:p>
+      <w:pPr>
+        <w:pStyle w:val="FirstParagraph"/>
+      </w:pPr>
+      <w:r>
+        <w:t xml:space="preserve">Analýza je zaznamenána ve zdrojovém kódu v programovacím jazyce R (Team}, b.r.), zveřejněném včetně zdrojových a zpracovaných dat na </w:t>
+      </w:r>
+      <w:hyperlink r:id="rId34">
+        <w:r>
+          <w:rPr>
+            <w:rStyle w:val="Hyperlink"/>
+          </w:rPr>
+          <w:t>platformě GitHub</w:t>
+        </w:r>
+      </w:hyperlink>
+      <w:r>
+        <w:t>. Otevřená data veřejného sektoru (Bouchal, b.r.a, b.r.b) zpracováváme pomocí balíků v jazyce R zveřejněných v oficiálním repozitáři CRAN. Reprodukovatelnost analytického prostředí je zajištěna systémem {renv}. Pro analýzu dat v R využíváme vícero dalších rozšíření (Dowle a Srinivasan, b.r.; Firke, b.r.; Wickham et al., b.r.; Warnes et al., b.r.; Wickham a Hester, b.r.; Wickham a Bryan, b.r.; Wickham, b.r.b, b.r.c, b.r.a; Sievert, b.r.).</w:t>
+      </w:r>
+    </w:p>
+    <w:p>
+      <w:pPr>
+        <w:pStyle w:val="Heading1"/>
+      </w:pPr>
+      <w:bookmarkStart w:id="12" w:name="literatura-a-zdroje"/>
+      <w:bookmarkEnd w:id="11"/>
+      <w:r>
+        <w:t>Literatura a zdroje</w:t>
+      </w:r>
+    </w:p>
+    <w:p>
+      <w:bookmarkStart w:id="13" w:name="ref-R-czso"/>
+      <w:bookmarkStart w:id="14" w:name="refs"/>
+      <w:r>
+        <w:t xml:space="preserve">Bouchal, Petr. b.r.a. „czso: Use Open Data from the Czech Statistical Office in R". </w:t>
+      </w:r>
+      <w:hyperlink r:id="rId35">
+        <w:r>
+          <w:rPr>
+            <w:rStyle w:val="Hyperlink"/>
+          </w:rPr>
+          <w:t>https://CRAN.R-project.org/package=czso},</w:t>
+        </w:r>
+      </w:hyperlink>
+      <w:r>
+        <w:t>.</w:t>
+      </w:r>
+    </w:p>
+    <w:p>
+      <w:bookmarkStart w:id="15" w:name="ref-R-statnipokladna"/>
+      <w:bookmarkEnd w:id="13"/>
+      <w:r>
+        <w:t xml:space="preserve">———. b.r.b. „statnipokladna: Use Data from the Czech Public Finance Database". </w:t>
+      </w:r>
+      <w:hyperlink r:id="rId36">
+        <w:r>
+          <w:rPr>
+            <w:rStyle w:val="Hyperlink"/>
+          </w:rPr>
+          <w:t>https://github.com/petrbouchal/statnipokladna</w:t>
+        </w:r>
+      </w:hyperlink>
+      <w:r>
+        <w:t>.</w:t>
+      </w:r>
+    </w:p>
+    <w:p>
+      <w:bookmarkStart w:id="16" w:name="ref-R-data.table"/>
+      <w:bookmarkEnd w:id="15"/>
+      <w:r>
+        <w:t xml:space="preserve">Dowle, Matt, a Arun Srinivasan. b.r. „data.table: Extension of `data.frame`". </w:t>
+      </w:r>
+      <w:hyperlink r:id="rId37">
+        <w:r>
+          <w:rPr>
+            <w:rStyle w:val="Hyperlink"/>
+          </w:rPr>
+          <w:t>https://CRAN.R-project.org/package=data.table},</w:t>
+        </w:r>
+      </w:hyperlink>
+      <w:r>
+        <w:t>.</w:t>
+      </w:r>
+    </w:p>
+    <w:p>
+      <w:bookmarkStart w:id="17" w:name="ref-R-janitor"/>
+      <w:bookmarkEnd w:id="16"/>
+      <w:r>
+        <w:t xml:space="preserve">Firke, Sam. b.r. „janitor: Simple Tools for Examining and Cleaning Dirty Data". </w:t>
+      </w:r>
+      <w:hyperlink r:id="rId38">
+        <w:r>
+          <w:rPr>
+            <w:rStyle w:val="Hyperlink"/>
+          </w:rPr>
+          <w:t>https://github.com/sfirke/janitor},</w:t>
+        </w:r>
+      </w:hyperlink>
+      <w:r>
+        <w:t>.</w:t>
+      </w:r>
+    </w:p>
+    <w:p>
+      <w:bookmarkStart w:id="18" w:name="ref-plotly2020"/>
+      <w:bookmarkEnd w:id="17"/>
+      <w:r>
+        <w:t xml:space="preserve">Sievert, Carson. b.r. </w:t>
+      </w:r>
+      <w:r>
+        <w:rPr>
+          <w:i/>
+          <w:iCs/>
+        </w:rPr>
+        <w:t>Interactive Web-Based Data Visualization with R, plotly, and shiny</w:t>
+      </w:r>
+      <w:r>
+        <w:t xml:space="preserve">. Chapman and Hall/CRC. </w:t>
+      </w:r>
+      <w:hyperlink>
+        <w:r>
+          <w:rPr>
+            <w:rStyle w:val="Hyperlink"/>
+          </w:rPr>
+          <w:t>https://plotly-r.com},</w:t>
+        </w:r>
+      </w:hyperlink>
+      <w:r>
+        <w:t>.</w:t>
+      </w:r>
+    </w:p>
+    <w:p>
+      <w:bookmarkStart w:id="19" w:name="ref-R-base"/>
+      <w:bookmarkEnd w:id="18"/>
+      <w:r>
+        <w:t xml:space="preserve">Team}, {R Core. b.r. „R: A Language and Environment for Statistical Computing". R Foundation for Statistical Computing. </w:t>
+      </w:r>
+      <w:hyperlink r:id="rId39">
+        <w:r>
+          <w:rPr>
+            <w:rStyle w:val="Hyperlink"/>
+          </w:rPr>
+          <w:t>https://www.R-project.org/},</w:t>
+        </w:r>
+      </w:hyperlink>
+      <w:r>
+        <w:t>.</w:t>
+      </w:r>
+    </w:p>
+    <w:p>
+      <w:bookmarkStart w:id="20" w:name="ref-R-gplots"/>
+      <w:bookmarkEnd w:id="19"/>
+      <w:r>
+        <w:t xml:space="preserve">Warnes, Gregory R., Ben Bolker, Lodewijk Bonebakker, Robert Gentleman, Wolfgang Huber, Andy Liaw, Thomas Lumley, et al. b.r. „gplots: Various R Programming Tools for Plotting Data". </w:t>
+      </w:r>
+      <w:hyperlink r:id="rId40">
+        <w:r>
+          <w:rPr>
+            <w:rStyle w:val="Hyperlink"/>
+          </w:rPr>
+          <w:t>https://github.com/talgalili/gplots},</w:t>
+        </w:r>
+      </w:hyperlink>
+      <w:r>
+        <w:t>.</w:t>
+      </w:r>
+    </w:p>
+    <w:p>
+      <w:bookmarkStart w:id="21" w:name="ref-ggplot22016"/>
+      <w:bookmarkEnd w:id="20"/>
+      <w:r>
+        <w:lastRenderedPageBreak/>
+        <w:t xml:space="preserve">Wickham, Hadley. b.r.a. </w:t>
+      </w:r>
+      <w:r>
+        <w:rPr>
+          <w:i/>
+          <w:iCs/>
+        </w:rPr>
+        <w:t>ggplot2: Elegant Graphics for Data Analysis</w:t>
+      </w:r>
+      <w:r>
+        <w:t xml:space="preserve">. Springer-Verlag New York. </w:t>
+      </w:r>
+      <w:hyperlink>
+        <w:r>
+          <w:rPr>
+            <w:rStyle w:val="Hyperlink"/>
+          </w:rPr>
+          <w:t>https://ggplot2.tidyverse.org},</w:t>
+        </w:r>
+      </w:hyperlink>
+      <w:r>
+        <w:t>.</w:t>
+      </w:r>
+    </w:p>
+    <w:p>
+      <w:bookmarkStart w:id="22" w:name="ref-R-stringr"/>
+      <w:bookmarkEnd w:id="21"/>
+      <w:r>
+        <w:t xml:space="preserve">———. b.r.b. „stringr: Simple, Consistent Wrappers for Common String Operations". </w:t>
+      </w:r>
+      <w:hyperlink r:id="rId41">
+        <w:r>
+          <w:rPr>
+            <w:rStyle w:val="Hyperlink"/>
+          </w:rPr>
+          <w:t>https://CRAN.R-project.org/package=stringr},</w:t>
+        </w:r>
+      </w:hyperlink>
+      <w:r>
+        <w:t>.</w:t>
+      </w:r>
+    </w:p>
+    <w:p>
+      <w:bookmarkStart w:id="23" w:name="ref-R-tidyr"/>
+      <w:bookmarkEnd w:id="22"/>
+      <w:r>
+        <w:t xml:space="preserve">———. b.r.c. „tidyr: Tidy Messy Data". </w:t>
+      </w:r>
+      <w:hyperlink r:id="rId42">
+        <w:r>
+          <w:rPr>
+            <w:rStyle w:val="Hyperlink"/>
+          </w:rPr>
+          <w:t>https://CRAN.R-project.org/package=tidyr},</w:t>
+        </w:r>
+      </w:hyperlink>
+      <w:r>
+        <w:t>.</w:t>
+      </w:r>
+    </w:p>
+    <w:p>
+      <w:bookmarkStart w:id="24" w:name="ref-R-readxl"/>
+      <w:bookmarkEnd w:id="23"/>
+      <w:r>
+        <w:t xml:space="preserve">Wickham, Hadley, a Jennifer Bryan. b.r. „readxl: Read Excel Files". </w:t>
+      </w:r>
+      <w:hyperlink r:id="rId43">
+        <w:r>
+          <w:rPr>
+            <w:rStyle w:val="Hyperlink"/>
+          </w:rPr>
+          <w:t>https://CRAN.R-project.org/package=readxl},</w:t>
+        </w:r>
+      </w:hyperlink>
+      <w:r>
+        <w:t>.</w:t>
+      </w:r>
+    </w:p>
+    <w:p>
+      <w:bookmarkStart w:id="25" w:name="ref-R-dplyr"/>
+      <w:bookmarkEnd w:id="24"/>
+      <w:r>
+        <w:t xml:space="preserve">Wickham, Hadley, Romain François, Lionel Henry, a Kirill Müller. b.r. „dplyr: A Grammar of Data Manipulation". </w:t>
+      </w:r>
+      <w:hyperlink r:id="rId44">
+        <w:r>
+          <w:rPr>
+            <w:rStyle w:val="Hyperlink"/>
+          </w:rPr>
+          <w:t>https://CRAN.R-project.org/package=dplyr},</w:t>
+        </w:r>
+      </w:hyperlink>
+      <w:r>
+        <w:t>.</w:t>
+      </w:r>
+    </w:p>
+    <w:p>
+      <w:bookmarkStart w:id="26" w:name="ref-R-readr"/>
+      <w:bookmarkEnd w:id="25"/>
+      <w:r>
+        <w:t xml:space="preserve">Wickham, Hadley, a Jim Hester. b.r. „readr: Read Rectangular Text Data". </w:t>
+      </w:r>
+      <w:hyperlink r:id="rId45">
+        <w:r>
+          <w:rPr>
+            <w:rStyle w:val="Hyperlink"/>
+          </w:rPr>
+          <w:t>https://CRAN.R-project.org/package=readr},</w:t>
+        </w:r>
+      </w:hyperlink>
+      <w:r>
+        <w:t>.</w:t>
+      </w:r>
+    </w:p>
+    <w:p>
+      <w:pPr>
+        <w:pStyle w:val="Heading1"/>
+      </w:pPr>
+      <w:bookmarkStart w:id="27" w:name="detaily"/>
+      <w:bookmarkEnd w:id="12"/>
+      <w:bookmarkEnd w:id="14"/>
+      <w:bookmarkEnd w:id="26"/>
+      <w:r>
+        <w:t>Detaily</w:t>
+      </w:r>
+    </w:p>
+    <w:p>
+      <w:pPr>
+        <w:pStyle w:val="FirstParagraph"/>
+      </w:pPr>
+      <w:r>
+        <w:t>Statistické ročenky České republiky - za jednotlivé roky. (Zde například ročenka 2025: https://csu.gov.cz/produkty/statisticka-rocenka-ceske-republiky-2025)</w:t>
+      </w:r>
+      <w:bookmarkEnd w:id="27"/>
+    </w:p>
     <w:sectPr>
-      <w:headerReference w:type="default" r:id="rId33"/>
-      <w:footerReference w:type="default" r:id="rId34"/>
-      <w:headerReference w:type="first" r:id="rId35"/>
-      <w:footerReference w:type="first" r:id="rId36"/>
+      <w:headerReference w:type="default" r:id="rId46"/>
+      <w:footerReference w:type="default" r:id="rId47"/>
+      <w:headerReference w:type="first" r:id="rId48"/>
+      <w:footerReference w:type="first" r:id="rId49"/>
       <w:pgSz w:w="11906" w:h="16838" w:code="9"/>
       <w:pgMar w:top="1247" w:right="1247" w:bottom="1247" w:left="1247" w:header="737" w:footer="567" w:gutter="0"/>
       <w:cols w:space="708"/>
@@ -1570,11 +2279,11 @@
 </file>
 
 <file path=word/endnotes.xml><?xml version="1.0" encoding="utf-8"?>
-<w:endnotes xmlns:wpc="http://schemas.microsoft.com/office/word/2010/wordprocessingCanvas" xmlns:cx="http://schemas.microsoft.com/office/drawing/2014/chartex" xmlns:cx1="http://schemas.microsoft.com/office/drawing/2015/9/8/chartex" xmlns:cx2="http://schemas.microsoft.com/office/drawing/2015/10/21/chartex" xmlns:cx3="http://schemas.microsoft.com/office/drawing/2016/5/9/chartex" xmlns:cx4="http://schemas.microsoft.com/office/drawing/2016/5/10/chartex" xmlns:cx5="http://schemas.microsoft.com/office/drawing/2016/5/11/chartex" xmlns:cx6="http://schemas.microsoft.com/office/drawing/2016/5/12/chartex" xmlns:cx7="http://schemas.microsoft.com/office/drawing/2016/5/13/chartex" xmlns:cx8="http://schemas.microsoft.com/office/drawing/2016/5/14/chartex" xmlns:mc="http://schemas.openxmlformats.org/markup-compatibility/2006" xmlns:m="http://schemas.openxmlformats.org/officeDocument/2006/math" xmlns:aink="http://schemas.microsoft.com/office/drawing/2016/ink" xmlns:am3d="http://schemas.microsoft.com/office/drawing/2017/model3d" xmlns:oel="http://schemas.microsoft.com/office/2019/extlst" xmlns:r="http://schemas.openxmlformats.org/officeDocument/2006/relationships" xmlns:wp14="http://schemas.microsoft.com/office/word/2010/wordprocessingDrawing" xmlns:wp="http://schemas.openxmlformats.org/drawingml/2006/wordprocessingDrawing" xmlns:wpg="http://schemas.microsoft.com/office/word/2010/wordprocessingGroup" xmlns:wpi="http://schemas.microsoft.com/office/word/2010/wordprocessingInk" xmlns:wps="http://schemas.microsoft.com/office/word/2010/wordprocessingShape" xmlns:o="urn:schemas-microsoft-com:office:office" xmlns:v="urn:schemas-microsoft-com:vml" xmlns:w10="urn:schemas-microsoft-com:office:word" xmlns:w="http://schemas.openxmlformats.org/wordprocessingml/2006/main" xmlns:w14="http://schemas.microsoft.com/office/word/2010/wordml" xmlns:w15="http://schemas.microsoft.com/office/word/2012/wordml" xmlns:w16cex="http://schemas.microsoft.com/office/word/2018/wordml/cex" xmlns:w16cid="http://schemas.microsoft.com/office/word/2016/wordml/cid" xmlns:w16="http://schemas.microsoft.com/office/word/2018/wordml" xmlns:w16sdtdh="http://schemas.microsoft.com/office/word/2020/wordml/sdtdatahash" xmlns:w16sdtfl="http://schemas.microsoft.com/office/word/2024/wordml/sdtformatlock" xmlns:w16se="http://schemas.microsoft.com/office/word/2015/wordml/symex" xmlns:w16du="http://schemas.microsoft.com/office/word/2023/wordml/word16du" xmlns:wne="http://schemas.microsoft.com/office/word/2006/wordml" mc:Ignorable="w14 w15 w16se w16cid w16 w16cex w16sdtdh w16sdtfl w16du wp14">
+<w:endnotes xmlns:wpc="http://schemas.microsoft.com/office/word/2010/wordprocessingCanvas" xmlns:cx="http://schemas.microsoft.com/office/drawing/2014/chartex" xmlns:cx1="http://schemas.microsoft.com/office/drawing/2015/9/8/chartex" xmlns:cx2="http://schemas.microsoft.com/office/drawing/2015/10/21/chartex" xmlns:cx3="http://schemas.microsoft.com/office/drawing/2016/5/9/chartex" xmlns:cx4="http://schemas.microsoft.com/office/drawing/2016/5/10/chartex" xmlns:cx5="http://schemas.microsoft.com/office/drawing/2016/5/11/chartex" xmlns:cx6="http://schemas.microsoft.com/office/drawing/2016/5/12/chartex" xmlns:cx7="http://schemas.microsoft.com/office/drawing/2016/5/13/chartex" xmlns:cx8="http://schemas.microsoft.com/office/drawing/2016/5/14/chartex" xmlns:mc="http://schemas.openxmlformats.org/markup-compatibility/2006" xmlns:m="http://schemas.openxmlformats.org/officeDocument/2006/math" xmlns:aink="http://schemas.microsoft.com/office/drawing/2016/ink" xmlns:am3d="http://schemas.microsoft.com/office/drawing/2017/model3d" xmlns:oel="http://schemas.microsoft.com/office/2019/extlst" xmlns:r="http://schemas.openxmlformats.org/officeDocument/2006/relationships" xmlns:wp14="http://schemas.microsoft.com/office/word/2010/wordprocessingDrawing" xmlns:wp="http://schemas.openxmlformats.org/drawingml/2006/wordprocessingDrawing" xmlns:wpg="http://schemas.microsoft.com/office/word/2010/wordprocessingGroup" xmlns:wpi="http://schemas.microsoft.com/office/word/2010/wordprocessingInk" xmlns:wps="http://schemas.microsoft.com/office/word/2010/wordprocessingShape" xmlns:o="urn:schemas-microsoft-com:office:office" xmlns:v="urn:schemas-microsoft-com:vml" xmlns:w10="urn:schemas-microsoft-com:office:word" xmlns:w="http://schemas.openxmlformats.org/wordprocessingml/2006/main" xmlns:w14="http://schemas.microsoft.com/office/word/2010/wordml" xmlns:w15="http://schemas.microsoft.com/office/word/2012/wordml" xmlns:w16cei="http://schemas.microsoft.com/office/word/2026/wordml/cei" xmlns:w16cex="http://schemas.microsoft.com/office/word/2018/wordml/cex" xmlns:w16cid="http://schemas.microsoft.com/office/word/2016/wordml/cid" xmlns:w16="http://schemas.microsoft.com/office/word/2018/wordml" xmlns:w16sdtdh="http://schemas.microsoft.com/office/word/2020/wordml/sdtdatahash" xmlns:w16sdtfl="http://schemas.microsoft.com/office/word/2024/wordml/sdtformatlock" xmlns:w16se="http://schemas.microsoft.com/office/word/2015/wordml/symex" xmlns:w16du="http://schemas.microsoft.com/office/word/2023/wordml/word16du" xmlns:wne="http://schemas.microsoft.com/office/word/2006/wordml" mc:Ignorable="w14 w15 w16se w16cid w16 w16cex w16sdtdh w16sdtfl w16du wp14">
   <w:endnote w:type="separator" w:id="-1">
     <w:p>
       <w:pPr>
-        <w:spacing w:line="240" w:lineRule="auto"/>
+        <w:spacing w:before="0" w:line="240" w:lineRule="auto"/>
       </w:pPr>
       <w:r>
         <w:separator/>
@@ -1584,25 +2293,18 @@
   <w:endnote w:type="continuationSeparator" w:id="0">
     <w:p>
       <w:pPr>
-        <w:spacing w:line="240" w:lineRule="auto"/>
+        <w:spacing w:before="0" w:line="240" w:lineRule="auto"/>
       </w:pPr>
       <w:r>
         <w:continuationSeparator/>
       </w:r>
-    </w:p>
-  </w:endnote>
-  <w:endnote w:type="continuationNotice" w:id="1">
-    <w:p>
-      <w:pPr>
-        <w:spacing w:line="240" w:lineRule="auto"/>
-      </w:pPr>
     </w:p>
   </w:endnote>
 </w:endnotes>
 </file>
 
 <file path=word/footer1.xml><?xml version="1.0" encoding="utf-8"?>
-<w:ftr xmlns:wpc="http://schemas.microsoft.com/office/word/2010/wordprocessingCanvas" xmlns:cx="http://schemas.microsoft.com/office/drawing/2014/chartex" xmlns:cx1="http://schemas.microsoft.com/office/drawing/2015/9/8/chartex" xmlns:cx2="http://schemas.microsoft.com/office/drawing/2015/10/21/chartex" xmlns:cx3="http://schemas.microsoft.com/office/drawing/2016/5/9/chartex" xmlns:cx4="http://schemas.microsoft.com/office/drawing/2016/5/10/chartex" xmlns:cx5="http://schemas.microsoft.com/office/drawing/2016/5/11/chartex" xmlns:cx6="http://schemas.microsoft.com/office/drawing/2016/5/12/chartex" xmlns:cx7="http://schemas.microsoft.com/office/drawing/2016/5/13/chartex" xmlns:cx8="http://schemas.microsoft.com/office/drawing/2016/5/14/chartex" xmlns:mc="http://schemas.openxmlformats.org/markup-compatibility/2006" xmlns:m="http://schemas.openxmlformats.org/officeDocument/2006/math" xmlns:aink="http://schemas.microsoft.com/office/drawing/2016/ink" xmlns:am3d="http://schemas.microsoft.com/office/drawing/2017/model3d" xmlns:oel="http://schemas.microsoft.com/office/2019/extlst" xmlns:r="http://schemas.openxmlformats.org/officeDocument/2006/relationships" xmlns:wp14="http://schemas.microsoft.com/office/word/2010/wordprocessingDrawing" xmlns:wp="http://schemas.openxmlformats.org/drawingml/2006/wordprocessingDrawing" xmlns:wpg="http://schemas.microsoft.com/office/word/2010/wordprocessingGroup" xmlns:wpi="http://schemas.microsoft.com/office/word/2010/wordprocessingInk" xmlns:wps="http://schemas.microsoft.com/office/word/2010/wordprocessingShape" xmlns:o="urn:schemas-microsoft-com:office:office" xmlns:v="urn:schemas-microsoft-com:vml" xmlns:w10="urn:schemas-microsoft-com:office:word" xmlns:w="http://schemas.openxmlformats.org/wordprocessingml/2006/main" xmlns:w14="http://schemas.microsoft.com/office/word/2010/wordml" xmlns:w15="http://schemas.microsoft.com/office/word/2012/wordml" xmlns:w16cex="http://schemas.microsoft.com/office/word/2018/wordml/cex" xmlns:w16cid="http://schemas.microsoft.com/office/word/2016/wordml/cid" xmlns:w16="http://schemas.microsoft.com/office/word/2018/wordml" xmlns:w16sdtdh="http://schemas.microsoft.com/office/word/2020/wordml/sdtdatahash" xmlns:w16sdtfl="http://schemas.microsoft.com/office/word/2024/wordml/sdtformatlock" xmlns:w16se="http://schemas.microsoft.com/office/word/2015/wordml/symex" xmlns:w16du="http://schemas.microsoft.com/office/word/2023/wordml/word16du" xmlns:wne="http://schemas.microsoft.com/office/word/2006/wordml" mc:Ignorable="w14 w15 w16se w16cid w16 w16cex w16sdtdh w16sdtfl w16du wp14">
+<w:ftr xmlns:wpc="http://schemas.microsoft.com/office/word/2010/wordprocessingCanvas" xmlns:cx="http://schemas.microsoft.com/office/drawing/2014/chartex" xmlns:cx1="http://schemas.microsoft.com/office/drawing/2015/9/8/chartex" xmlns:cx2="http://schemas.microsoft.com/office/drawing/2015/10/21/chartex" xmlns:cx3="http://schemas.microsoft.com/office/drawing/2016/5/9/chartex" xmlns:cx4="http://schemas.microsoft.com/office/drawing/2016/5/10/chartex" xmlns:cx5="http://schemas.microsoft.com/office/drawing/2016/5/11/chartex" xmlns:cx6="http://schemas.microsoft.com/office/drawing/2016/5/12/chartex" xmlns:cx7="http://schemas.microsoft.com/office/drawing/2016/5/13/chartex" xmlns:cx8="http://schemas.microsoft.com/office/drawing/2016/5/14/chartex" xmlns:mc="http://schemas.openxmlformats.org/markup-compatibility/2006" xmlns:m="http://schemas.openxmlformats.org/officeDocument/2006/math" xmlns:aink="http://schemas.microsoft.com/office/drawing/2016/ink" xmlns:am3d="http://schemas.microsoft.com/office/drawing/2017/model3d" xmlns:oel="http://schemas.microsoft.com/office/2019/extlst" xmlns:r="http://schemas.openxmlformats.org/officeDocument/2006/relationships" xmlns:wp14="http://schemas.microsoft.com/office/word/2010/wordprocessingDrawing" xmlns:wp="http://schemas.openxmlformats.org/drawingml/2006/wordprocessingDrawing" xmlns:wpg="http://schemas.microsoft.com/office/word/2010/wordprocessingGroup" xmlns:wpi="http://schemas.microsoft.com/office/word/2010/wordprocessingInk" xmlns:wps="http://schemas.microsoft.com/office/word/2010/wordprocessingShape" xmlns:o="urn:schemas-microsoft-com:office:office" xmlns:v="urn:schemas-microsoft-com:vml" xmlns:w10="urn:schemas-microsoft-com:office:word" xmlns:w="http://schemas.openxmlformats.org/wordprocessingml/2006/main" xmlns:w14="http://schemas.microsoft.com/office/word/2010/wordml" xmlns:w15="http://schemas.microsoft.com/office/word/2012/wordml" xmlns:w16cei="http://schemas.microsoft.com/office/word/2026/wordml/cei" xmlns:w16cex="http://schemas.microsoft.com/office/word/2018/wordml/cex" xmlns:w16cid="http://schemas.microsoft.com/office/word/2016/wordml/cid" xmlns:w16="http://schemas.microsoft.com/office/word/2018/wordml" xmlns:w16sdtdh="http://schemas.microsoft.com/office/word/2020/wordml/sdtdatahash" xmlns:w16sdtfl="http://schemas.microsoft.com/office/word/2024/wordml/sdtformatlock" xmlns:w16se="http://schemas.microsoft.com/office/word/2015/wordml/symex" xmlns:w16du="http://schemas.microsoft.com/office/word/2023/wordml/word16du" xmlns:wne="http://schemas.microsoft.com/office/word/2006/wordml" mc:Ignorable="w14 w15 w16se w16cid w16 w16cex w16sdtdh w16sdtfl w16du wp14">
   <w:sdt>
     <w:sdtPr>
       <w:id w:val="1589121001"/>
@@ -1642,7 +2344,7 @@
 </file>
 
 <file path=word/footer2.xml><?xml version="1.0" encoding="utf-8"?>
-<w:ftr xmlns:wpc="http://schemas.microsoft.com/office/word/2010/wordprocessingCanvas" xmlns:cx="http://schemas.microsoft.com/office/drawing/2014/chartex" xmlns:cx1="http://schemas.microsoft.com/office/drawing/2015/9/8/chartex" xmlns:cx2="http://schemas.microsoft.com/office/drawing/2015/10/21/chartex" xmlns:cx3="http://schemas.microsoft.com/office/drawing/2016/5/9/chartex" xmlns:cx4="http://schemas.microsoft.com/office/drawing/2016/5/10/chartex" xmlns:cx5="http://schemas.microsoft.com/office/drawing/2016/5/11/chartex" xmlns:cx6="http://schemas.microsoft.com/office/drawing/2016/5/12/chartex" xmlns:cx7="http://schemas.microsoft.com/office/drawing/2016/5/13/chartex" xmlns:cx8="http://schemas.microsoft.com/office/drawing/2016/5/14/chartex" xmlns:mc="http://schemas.openxmlformats.org/markup-compatibility/2006" xmlns:m="http://schemas.openxmlformats.org/officeDocument/2006/math" xmlns:aink="http://schemas.microsoft.com/office/drawing/2016/ink" xmlns:am3d="http://schemas.microsoft.com/office/drawing/2017/model3d" xmlns:oel="http://schemas.microsoft.com/office/2019/extlst" xmlns:r="http://schemas.openxmlformats.org/officeDocument/2006/relationships" xmlns:wp14="http://schemas.microsoft.com/office/word/2010/wordprocessingDrawing" xmlns:wp="http://schemas.openxmlformats.org/drawingml/2006/wordprocessingDrawing" xmlns:wpg="http://schemas.microsoft.com/office/word/2010/wordprocessingGroup" xmlns:wpi="http://schemas.microsoft.com/office/word/2010/wordprocessingInk" xmlns:wps="http://schemas.microsoft.com/office/word/2010/wordprocessingShape" xmlns:o="urn:schemas-microsoft-com:office:office" xmlns:v="urn:schemas-microsoft-com:vml" xmlns:w10="urn:schemas-microsoft-com:office:word" xmlns:w="http://schemas.openxmlformats.org/wordprocessingml/2006/main" xmlns:w14="http://schemas.microsoft.com/office/word/2010/wordml" xmlns:w15="http://schemas.microsoft.com/office/word/2012/wordml" xmlns:w16cex="http://schemas.microsoft.com/office/word/2018/wordml/cex" xmlns:w16cid="http://schemas.microsoft.com/office/word/2016/wordml/cid" xmlns:w16="http://schemas.microsoft.com/office/word/2018/wordml" xmlns:w16sdtdh="http://schemas.microsoft.com/office/word/2020/wordml/sdtdatahash" xmlns:w16sdtfl="http://schemas.microsoft.com/office/word/2024/wordml/sdtformatlock" xmlns:w16se="http://schemas.microsoft.com/office/word/2015/wordml/symex" xmlns:w16du="http://schemas.microsoft.com/office/word/2023/wordml/word16du" xmlns:wne="http://schemas.microsoft.com/office/word/2006/wordml" mc:Ignorable="w14 w15 w16se w16cid w16 w16cex w16sdtdh w16sdtfl w16du wp14">
+<w:ftr xmlns:wpc="http://schemas.microsoft.com/office/word/2010/wordprocessingCanvas" xmlns:cx="http://schemas.microsoft.com/office/drawing/2014/chartex" xmlns:cx1="http://schemas.microsoft.com/office/drawing/2015/9/8/chartex" xmlns:cx2="http://schemas.microsoft.com/office/drawing/2015/10/21/chartex" xmlns:cx3="http://schemas.microsoft.com/office/drawing/2016/5/9/chartex" xmlns:cx4="http://schemas.microsoft.com/office/drawing/2016/5/10/chartex" xmlns:cx5="http://schemas.microsoft.com/office/drawing/2016/5/11/chartex" xmlns:cx6="http://schemas.microsoft.com/office/drawing/2016/5/12/chartex" xmlns:cx7="http://schemas.microsoft.com/office/drawing/2016/5/13/chartex" xmlns:cx8="http://schemas.microsoft.com/office/drawing/2016/5/14/chartex" xmlns:mc="http://schemas.openxmlformats.org/markup-compatibility/2006" xmlns:m="http://schemas.openxmlformats.org/officeDocument/2006/math" xmlns:aink="http://schemas.microsoft.com/office/drawing/2016/ink" xmlns:am3d="http://schemas.microsoft.com/office/drawing/2017/model3d" xmlns:oel="http://schemas.microsoft.com/office/2019/extlst" xmlns:r="http://schemas.openxmlformats.org/officeDocument/2006/relationships" xmlns:wp14="http://schemas.microsoft.com/office/word/2010/wordprocessingDrawing" xmlns:wp="http://schemas.openxmlformats.org/drawingml/2006/wordprocessingDrawing" xmlns:wpg="http://schemas.microsoft.com/office/word/2010/wordprocessingGroup" xmlns:wpi="http://schemas.microsoft.com/office/word/2010/wordprocessingInk" xmlns:wps="http://schemas.microsoft.com/office/word/2010/wordprocessingShape" xmlns:o="urn:schemas-microsoft-com:office:office" xmlns:v="urn:schemas-microsoft-com:vml" xmlns:w10="urn:schemas-microsoft-com:office:word" xmlns:w="http://schemas.openxmlformats.org/wordprocessingml/2006/main" xmlns:w14="http://schemas.microsoft.com/office/word/2010/wordml" xmlns:w15="http://schemas.microsoft.com/office/word/2012/wordml" xmlns:w16cei="http://schemas.microsoft.com/office/word/2026/wordml/cei" xmlns:w16cex="http://schemas.microsoft.com/office/word/2018/wordml/cex" xmlns:w16cid="http://schemas.microsoft.com/office/word/2016/wordml/cid" xmlns:w16="http://schemas.microsoft.com/office/word/2018/wordml" xmlns:w16sdtdh="http://schemas.microsoft.com/office/word/2020/wordml/sdtdatahash" xmlns:w16sdtfl="http://schemas.microsoft.com/office/word/2024/wordml/sdtformatlock" xmlns:w16se="http://schemas.microsoft.com/office/word/2015/wordml/symex" xmlns:w16du="http://schemas.microsoft.com/office/word/2023/wordml/word16du" xmlns:wne="http://schemas.microsoft.com/office/word/2006/wordml" mc:Ignorable="w14 w15 w16se w16cid w16 w16cex w16sdtdh w16sdtfl w16du wp14">
   <w:sdt>
     <w:sdtPr>
       <w:id w:val="-378481179"/>
@@ -1682,11 +2384,11 @@
 </file>
 
 <file path=word/footnotes.xml><?xml version="1.0" encoding="utf-8"?>
-<w:footnotes xmlns:wpc="http://schemas.microsoft.com/office/word/2010/wordprocessingCanvas" xmlns:cx="http://schemas.microsoft.com/office/drawing/2014/chartex" xmlns:cx1="http://schemas.microsoft.com/office/drawing/2015/9/8/chartex" xmlns:cx2="http://schemas.microsoft.com/office/drawing/2015/10/21/chartex" xmlns:cx3="http://schemas.microsoft.com/office/drawing/2016/5/9/chartex" xmlns:cx4="http://schemas.microsoft.com/office/drawing/2016/5/10/chartex" xmlns:cx5="http://schemas.microsoft.com/office/drawing/2016/5/11/chartex" xmlns:cx6="http://schemas.microsoft.com/office/drawing/2016/5/12/chartex" xmlns:cx7="http://schemas.microsoft.com/office/drawing/2016/5/13/chartex" xmlns:cx8="http://schemas.microsoft.com/office/drawing/2016/5/14/chartex" xmlns:mc="http://schemas.openxmlformats.org/markup-compatibility/2006" xmlns:m="http://schemas.openxmlformats.org/officeDocument/2006/math" xmlns:aink="http://schemas.microsoft.com/office/drawing/2016/ink" xmlns:am3d="http://schemas.microsoft.com/office/drawing/2017/model3d" xmlns:oel="http://schemas.microsoft.com/office/2019/extlst" xmlns:r="http://schemas.openxmlformats.org/officeDocument/2006/relationships" xmlns:wp14="http://schemas.microsoft.com/office/word/2010/wordprocessingDrawing" xmlns:wp="http://schemas.openxmlformats.org/drawingml/2006/wordprocessingDrawing" xmlns:wpg="http://schemas.microsoft.com/office/word/2010/wordprocessingGroup" xmlns:wpi="http://schemas.microsoft.com/office/word/2010/wordprocessingInk" xmlns:wps="http://schemas.microsoft.com/office/word/2010/wordprocessingShape" xmlns:o="urn:schemas-microsoft-com:office:office" xmlns:v="urn:schemas-microsoft-com:vml" xmlns:w10="urn:schemas-microsoft-com:office:word" xmlns:w="http://schemas.openxmlformats.org/wordprocessingml/2006/main" xmlns:w14="http://schemas.microsoft.com/office/word/2010/wordml" xmlns:w15="http://schemas.microsoft.com/office/word/2012/wordml" xmlns:w16cex="http://schemas.microsoft.com/office/word/2018/wordml/cex" xmlns:w16cid="http://schemas.microsoft.com/office/word/2016/wordml/cid" xmlns:w16="http://schemas.microsoft.com/office/word/2018/wordml" xmlns:w16sdtdh="http://schemas.microsoft.com/office/word/2020/wordml/sdtdatahash" xmlns:w16sdtfl="http://schemas.microsoft.com/office/word/2024/wordml/sdtformatlock" xmlns:w16se="http://schemas.microsoft.com/office/word/2015/wordml/symex" xmlns:w16du="http://schemas.microsoft.com/office/word/2023/wordml/word16du" xmlns:wne="http://schemas.microsoft.com/office/word/2006/wordml" mc:Ignorable="w14 w15 w16se w16cid w16 w16cex w16sdtdh w16sdtfl w16du wp14">
+<w:footnotes xmlns:wpc="http://schemas.microsoft.com/office/word/2010/wordprocessingCanvas" xmlns:cx="http://schemas.microsoft.com/office/drawing/2014/chartex" xmlns:cx1="http://schemas.microsoft.com/office/drawing/2015/9/8/chartex" xmlns:cx2="http://schemas.microsoft.com/office/drawing/2015/10/21/chartex" xmlns:cx3="http://schemas.microsoft.com/office/drawing/2016/5/9/chartex" xmlns:cx4="http://schemas.microsoft.com/office/drawing/2016/5/10/chartex" xmlns:cx5="http://schemas.microsoft.com/office/drawing/2016/5/11/chartex" xmlns:cx6="http://schemas.microsoft.com/office/drawing/2016/5/12/chartex" xmlns:cx7="http://schemas.microsoft.com/office/drawing/2016/5/13/chartex" xmlns:cx8="http://schemas.microsoft.com/office/drawing/2016/5/14/chartex" xmlns:mc="http://schemas.openxmlformats.org/markup-compatibility/2006" xmlns:m="http://schemas.openxmlformats.org/officeDocument/2006/math" xmlns:aink="http://schemas.microsoft.com/office/drawing/2016/ink" xmlns:am3d="http://schemas.microsoft.com/office/drawing/2017/model3d" xmlns:oel="http://schemas.microsoft.com/office/2019/extlst" xmlns:r="http://schemas.openxmlformats.org/officeDocument/2006/relationships" xmlns:wp14="http://schemas.microsoft.com/office/word/2010/wordprocessingDrawing" xmlns:wp="http://schemas.openxmlformats.org/drawingml/2006/wordprocessingDrawing" xmlns:wpg="http://schemas.microsoft.com/office/word/2010/wordprocessingGroup" xmlns:wpi="http://schemas.microsoft.com/office/word/2010/wordprocessingInk" xmlns:wps="http://schemas.microsoft.com/office/word/2010/wordprocessingShape" xmlns:o="urn:schemas-microsoft-com:office:office" xmlns:v="urn:schemas-microsoft-com:vml" xmlns:w10="urn:schemas-microsoft-com:office:word" xmlns:w="http://schemas.openxmlformats.org/wordprocessingml/2006/main" xmlns:w14="http://schemas.microsoft.com/office/word/2010/wordml" xmlns:w15="http://schemas.microsoft.com/office/word/2012/wordml" xmlns:w16cei="http://schemas.microsoft.com/office/word/2026/wordml/cei" xmlns:w16cex="http://schemas.microsoft.com/office/word/2018/wordml/cex" xmlns:w16cid="http://schemas.microsoft.com/office/word/2016/wordml/cid" xmlns:w16="http://schemas.microsoft.com/office/word/2018/wordml" xmlns:w16sdtdh="http://schemas.microsoft.com/office/word/2020/wordml/sdtdatahash" xmlns:w16sdtfl="http://schemas.microsoft.com/office/word/2024/wordml/sdtformatlock" xmlns:w16se="http://schemas.microsoft.com/office/word/2015/wordml/symex" xmlns:w16du="http://schemas.microsoft.com/office/word/2023/wordml/word16du" xmlns:wne="http://schemas.microsoft.com/office/word/2006/wordml" mc:Ignorable="w14 w15 w16se w16cid w16 w16cex w16sdtdh w16sdtfl w16du wp14">
   <w:footnote w:type="separator" w:id="-1">
     <w:p>
       <w:pPr>
-        <w:spacing w:line="240" w:lineRule="auto"/>
+        <w:spacing w:before="0" w:line="240" w:lineRule="auto"/>
       </w:pPr>
       <w:r>
         <w:separator/>
@@ -1696,21 +2398,14 @@
   <w:footnote w:type="continuationSeparator" w:id="0">
     <w:p>
       <w:pPr>
-        <w:spacing w:line="240" w:lineRule="auto"/>
+        <w:spacing w:before="0" w:line="240" w:lineRule="auto"/>
       </w:pPr>
       <w:r>
         <w:continuationSeparator/>
       </w:r>
     </w:p>
   </w:footnote>
-  <w:footnote w:type="continuationNotice" w:id="1">
-    <w:p>
-      <w:pPr>
-        <w:spacing w:line="240" w:lineRule="auto"/>
-      </w:pPr>
-    </w:p>
-  </w:footnote>
-  <w:footnote w:id="2">
+  <w:footnote w:id="1">
     <w:p>
       <w:pPr>
         <w:pStyle w:val="FootnoteText"/>
@@ -1792,7 +2487,7 @@
 </file>
 
 <file path=word/header1.xml><?xml version="1.0" encoding="utf-8"?>
-<w:hdr xmlns:wpc="http://schemas.microsoft.com/office/word/2010/wordprocessingCanvas" xmlns:cx="http://schemas.microsoft.com/office/drawing/2014/chartex" xmlns:cx1="http://schemas.microsoft.com/office/drawing/2015/9/8/chartex" xmlns:cx2="http://schemas.microsoft.com/office/drawing/2015/10/21/chartex" xmlns:cx3="http://schemas.microsoft.com/office/drawing/2016/5/9/chartex" xmlns:cx4="http://schemas.microsoft.com/office/drawing/2016/5/10/chartex" xmlns:cx5="http://schemas.microsoft.com/office/drawing/2016/5/11/chartex" xmlns:cx6="http://schemas.microsoft.com/office/drawing/2016/5/12/chartex" xmlns:cx7="http://schemas.microsoft.com/office/drawing/2016/5/13/chartex" xmlns:cx8="http://schemas.microsoft.com/office/drawing/2016/5/14/chartex" xmlns:mc="http://schemas.openxmlformats.org/markup-compatibility/2006" xmlns:m="http://schemas.openxmlformats.org/officeDocument/2006/math" xmlns:aink="http://schemas.microsoft.com/office/drawing/2016/ink" xmlns:am3d="http://schemas.microsoft.com/office/drawing/2017/model3d" xmlns:oel="http://schemas.microsoft.com/office/2019/extlst" xmlns:r="http://schemas.openxmlformats.org/officeDocument/2006/relationships" xmlns:wp14="http://schemas.microsoft.com/office/word/2010/wordprocessingDrawing" xmlns:wp="http://schemas.openxmlformats.org/drawingml/2006/wordprocessingDrawing" xmlns:wpg="http://schemas.microsoft.com/office/word/2010/wordprocessingGroup" xmlns:wpi="http://schemas.microsoft.com/office/word/2010/wordprocessingInk" xmlns:wps="http://schemas.microsoft.com/office/word/2010/wordprocessingShape" xmlns:o="urn:schemas-microsoft-com:office:office" xmlns:v="urn:schemas-microsoft-com:vml" xmlns:w10="urn:schemas-microsoft-com:office:word" xmlns:w="http://schemas.openxmlformats.org/wordprocessingml/2006/main" xmlns:w14="http://schemas.microsoft.com/office/word/2010/wordml" xmlns:w15="http://schemas.microsoft.com/office/word/2012/wordml" xmlns:w16cex="http://schemas.microsoft.com/office/word/2018/wordml/cex" xmlns:w16cid="http://schemas.microsoft.com/office/word/2016/wordml/cid" xmlns:w16="http://schemas.microsoft.com/office/word/2018/wordml" xmlns:w16sdtdh="http://schemas.microsoft.com/office/word/2020/wordml/sdtdatahash" xmlns:w16sdtfl="http://schemas.microsoft.com/office/word/2024/wordml/sdtformatlock" xmlns:w16se="http://schemas.microsoft.com/office/word/2015/wordml/symex" xmlns:w16du="http://schemas.microsoft.com/office/word/2023/wordml/word16du" xmlns:wne="http://schemas.microsoft.com/office/word/2006/wordml" mc:Ignorable="w14 w15 w16se w16cid w16 w16cex w16sdtdh w16sdtfl w16du wp14">
+<w:hdr xmlns:wpc="http://schemas.microsoft.com/office/word/2010/wordprocessingCanvas" xmlns:cx="http://schemas.microsoft.com/office/drawing/2014/chartex" xmlns:cx1="http://schemas.microsoft.com/office/drawing/2015/9/8/chartex" xmlns:cx2="http://schemas.microsoft.com/office/drawing/2015/10/21/chartex" xmlns:cx3="http://schemas.microsoft.com/office/drawing/2016/5/9/chartex" xmlns:cx4="http://schemas.microsoft.com/office/drawing/2016/5/10/chartex" xmlns:cx5="http://schemas.microsoft.com/office/drawing/2016/5/11/chartex" xmlns:cx6="http://schemas.microsoft.com/office/drawing/2016/5/12/chartex" xmlns:cx7="http://schemas.microsoft.com/office/drawing/2016/5/13/chartex" xmlns:cx8="http://schemas.microsoft.com/office/drawing/2016/5/14/chartex" xmlns:mc="http://schemas.openxmlformats.org/markup-compatibility/2006" xmlns:m="http://schemas.openxmlformats.org/officeDocument/2006/math" xmlns:aink="http://schemas.microsoft.com/office/drawing/2016/ink" xmlns:am3d="http://schemas.microsoft.com/office/drawing/2017/model3d" xmlns:oel="http://schemas.microsoft.com/office/2019/extlst" xmlns:r="http://schemas.openxmlformats.org/officeDocument/2006/relationships" xmlns:wp14="http://schemas.microsoft.com/office/word/2010/wordprocessingDrawing" xmlns:wp="http://schemas.openxmlformats.org/drawingml/2006/wordprocessingDrawing" xmlns:wpg="http://schemas.microsoft.com/office/word/2010/wordprocessingGroup" xmlns:wpi="http://schemas.microsoft.com/office/word/2010/wordprocessingInk" xmlns:wps="http://schemas.microsoft.com/office/word/2010/wordprocessingShape" xmlns:o="urn:schemas-microsoft-com:office:office" xmlns:v="urn:schemas-microsoft-com:vml" xmlns:w10="urn:schemas-microsoft-com:office:word" xmlns:w="http://schemas.openxmlformats.org/wordprocessingml/2006/main" xmlns:w14="http://schemas.microsoft.com/office/word/2010/wordml" xmlns:w15="http://schemas.microsoft.com/office/word/2012/wordml" xmlns:w16cei="http://schemas.microsoft.com/office/word/2026/wordml/cei" xmlns:w16cex="http://schemas.microsoft.com/office/word/2018/wordml/cex" xmlns:w16cid="http://schemas.microsoft.com/office/word/2016/wordml/cid" xmlns:w16="http://schemas.microsoft.com/office/word/2018/wordml" xmlns:w16sdtdh="http://schemas.microsoft.com/office/word/2020/wordml/sdtdatahash" xmlns:w16sdtfl="http://schemas.microsoft.com/office/word/2024/wordml/sdtformatlock" xmlns:w16se="http://schemas.microsoft.com/office/word/2015/wordml/symex" xmlns:w16du="http://schemas.microsoft.com/office/word/2023/wordml/word16du" xmlns:wne="http://schemas.microsoft.com/office/word/2006/wordml" mc:Ignorable="w14 w15 w16se w16cid w16 w16cex w16sdtdh w16sdtfl w16du wp14">
   <w:p>
     <w:pPr>
       <w:pBdr>
@@ -1909,7 +2604,7 @@
 </file>
 
 <file path=word/header2.xml><?xml version="1.0" encoding="utf-8"?>
-<w:hdr xmlns:wpc="http://schemas.microsoft.com/office/word/2010/wordprocessingCanvas" xmlns:cx="http://schemas.microsoft.com/office/drawing/2014/chartex" xmlns:cx1="http://schemas.microsoft.com/office/drawing/2015/9/8/chartex" xmlns:cx2="http://schemas.microsoft.com/office/drawing/2015/10/21/chartex" xmlns:cx3="http://schemas.microsoft.com/office/drawing/2016/5/9/chartex" xmlns:cx4="http://schemas.microsoft.com/office/drawing/2016/5/10/chartex" xmlns:cx5="http://schemas.microsoft.com/office/drawing/2016/5/11/chartex" xmlns:cx6="http://schemas.microsoft.com/office/drawing/2016/5/12/chartex" xmlns:cx7="http://schemas.microsoft.com/office/drawing/2016/5/13/chartex" xmlns:cx8="http://schemas.microsoft.com/office/drawing/2016/5/14/chartex" xmlns:mc="http://schemas.openxmlformats.org/markup-compatibility/2006" xmlns:m="http://schemas.openxmlformats.org/officeDocument/2006/math" xmlns:aink="http://schemas.microsoft.com/office/drawing/2016/ink" xmlns:am3d="http://schemas.microsoft.com/office/drawing/2017/model3d" xmlns:oel="http://schemas.microsoft.com/office/2019/extlst" xmlns:r="http://schemas.openxmlformats.org/officeDocument/2006/relationships" xmlns:wp14="http://schemas.microsoft.com/office/word/2010/wordprocessingDrawing" xmlns:wp="http://schemas.openxmlformats.org/drawingml/2006/wordprocessingDrawing" xmlns:wpg="http://schemas.microsoft.com/office/word/2010/wordprocessingGroup" xmlns:wpi="http://schemas.microsoft.com/office/word/2010/wordprocessingInk" xmlns:wps="http://schemas.microsoft.com/office/word/2010/wordprocessingShape" xmlns:o="urn:schemas-microsoft-com:office:office" xmlns:v="urn:schemas-microsoft-com:vml" xmlns:w10="urn:schemas-microsoft-com:office:word" xmlns:w="http://schemas.openxmlformats.org/wordprocessingml/2006/main" xmlns:w14="http://schemas.microsoft.com/office/word/2010/wordml" xmlns:w15="http://schemas.microsoft.com/office/word/2012/wordml" xmlns:w16cex="http://schemas.microsoft.com/office/word/2018/wordml/cex" xmlns:w16cid="http://schemas.microsoft.com/office/word/2016/wordml/cid" xmlns:w16="http://schemas.microsoft.com/office/word/2018/wordml" xmlns:w16sdtdh="http://schemas.microsoft.com/office/word/2020/wordml/sdtdatahash" xmlns:w16sdtfl="http://schemas.microsoft.com/office/word/2024/wordml/sdtformatlock" xmlns:w16se="http://schemas.microsoft.com/office/word/2015/wordml/symex" xmlns:w16du="http://schemas.microsoft.com/office/word/2023/wordml/word16du" xmlns:wne="http://schemas.microsoft.com/office/word/2006/wordml" mc:Ignorable="w14 w15 w16se w16cid w16 w16cex w16sdtdh w16sdtfl w16du wp14">
+<w:hdr xmlns:wpc="http://schemas.microsoft.com/office/word/2010/wordprocessingCanvas" xmlns:cx="http://schemas.microsoft.com/office/drawing/2014/chartex" xmlns:cx1="http://schemas.microsoft.com/office/drawing/2015/9/8/chartex" xmlns:cx2="http://schemas.microsoft.com/office/drawing/2015/10/21/chartex" xmlns:cx3="http://schemas.microsoft.com/office/drawing/2016/5/9/chartex" xmlns:cx4="http://schemas.microsoft.com/office/drawing/2016/5/10/chartex" xmlns:cx5="http://schemas.microsoft.com/office/drawing/2016/5/11/chartex" xmlns:cx6="http://schemas.microsoft.com/office/drawing/2016/5/12/chartex" xmlns:cx7="http://schemas.microsoft.com/office/drawing/2016/5/13/chartex" xmlns:cx8="http://schemas.microsoft.com/office/drawing/2016/5/14/chartex" xmlns:mc="http://schemas.openxmlformats.org/markup-compatibility/2006" xmlns:m="http://schemas.openxmlformats.org/officeDocument/2006/math" xmlns:aink="http://schemas.microsoft.com/office/drawing/2016/ink" xmlns:am3d="http://schemas.microsoft.com/office/drawing/2017/model3d" xmlns:oel="http://schemas.microsoft.com/office/2019/extlst" xmlns:r="http://schemas.openxmlformats.org/officeDocument/2006/relationships" xmlns:wp14="http://schemas.microsoft.com/office/word/2010/wordprocessingDrawing" xmlns:wp="http://schemas.openxmlformats.org/drawingml/2006/wordprocessingDrawing" xmlns:wpg="http://schemas.microsoft.com/office/word/2010/wordprocessingGroup" xmlns:wpi="http://schemas.microsoft.com/office/word/2010/wordprocessingInk" xmlns:wps="http://schemas.microsoft.com/office/word/2010/wordprocessingShape" xmlns:o="urn:schemas-microsoft-com:office:office" xmlns:v="urn:schemas-microsoft-com:vml" xmlns:w10="urn:schemas-microsoft-com:office:word" xmlns:w="http://schemas.openxmlformats.org/wordprocessingml/2006/main" xmlns:w14="http://schemas.microsoft.com/office/word/2010/wordml" xmlns:w15="http://schemas.microsoft.com/office/word/2012/wordml" xmlns:w16cei="http://schemas.microsoft.com/office/word/2026/wordml/cei" xmlns:w16cex="http://schemas.microsoft.com/office/word/2018/wordml/cex" xmlns:w16cid="http://schemas.microsoft.com/office/word/2016/wordml/cid" xmlns:w16="http://schemas.microsoft.com/office/word/2018/wordml" xmlns:w16sdtdh="http://schemas.microsoft.com/office/word/2020/wordml/sdtdatahash" xmlns:w16sdtfl="http://schemas.microsoft.com/office/word/2024/wordml/sdtformatlock" xmlns:w16se="http://schemas.microsoft.com/office/word/2015/wordml/symex" xmlns:w16du="http://schemas.microsoft.com/office/word/2023/wordml/word16du" xmlns:wne="http://schemas.microsoft.com/office/word/2006/wordml" mc:Ignorable="w14 w15 w16se w16cid w16 w16cex w16sdtdh w16sdtfl w16du wp14">
   <w:p>
     <w:pPr>
       <w:pStyle w:val="Header"/>
@@ -1928,7 +2623,7 @@
 </file>
 
 <file path=word/numbering.xml><?xml version="1.0" encoding="utf-8"?>
-<w:numbering xmlns:wpc="http://schemas.microsoft.com/office/word/2010/wordprocessingCanvas" xmlns:cx="http://schemas.microsoft.com/office/drawing/2014/chartex" xmlns:cx1="http://schemas.microsoft.com/office/drawing/2015/9/8/chartex" xmlns:cx2="http://schemas.microsoft.com/office/drawing/2015/10/21/chartex" xmlns:cx3="http://schemas.microsoft.com/office/drawing/2016/5/9/chartex" xmlns:cx4="http://schemas.microsoft.com/office/drawing/2016/5/10/chartex" xmlns:cx5="http://schemas.microsoft.com/office/drawing/2016/5/11/chartex" xmlns:cx6="http://schemas.microsoft.com/office/drawing/2016/5/12/chartex" xmlns:cx7="http://schemas.microsoft.com/office/drawing/2016/5/13/chartex" xmlns:cx8="http://schemas.microsoft.com/office/drawing/2016/5/14/chartex" xmlns:mc="http://schemas.openxmlformats.org/markup-compatibility/2006" xmlns:m="http://schemas.openxmlformats.org/officeDocument/2006/math" xmlns:aink="http://schemas.microsoft.com/office/drawing/2016/ink" xmlns:am3d="http://schemas.microsoft.com/office/drawing/2017/model3d" xmlns:oel="http://schemas.microsoft.com/office/2019/extlst" xmlns:r="http://schemas.openxmlformats.org/officeDocument/2006/relationships" xmlns:wp14="http://schemas.microsoft.com/office/word/2010/wordprocessingDrawing" xmlns:wp="http://schemas.openxmlformats.org/drawingml/2006/wordprocessingDrawing" xmlns:wpg="http://schemas.microsoft.com/office/word/2010/wordprocessingGroup" xmlns:wpi="http://schemas.microsoft.com/office/word/2010/wordprocessingInk" xmlns:wps="http://schemas.microsoft.com/office/word/2010/wordprocessingShape" xmlns:o="urn:schemas-microsoft-com:office:office" xmlns:v="urn:schemas-microsoft-com:vml" xmlns:w10="urn:schemas-microsoft-com:office:word" xmlns:w="http://schemas.openxmlformats.org/wordprocessingml/2006/main" xmlns:w14="http://schemas.microsoft.com/office/word/2010/wordml" xmlns:w15="http://schemas.microsoft.com/office/word/2012/wordml" xmlns:w16cex="http://schemas.microsoft.com/office/word/2018/wordml/cex" xmlns:w16cid="http://schemas.microsoft.com/office/word/2016/wordml/cid" xmlns:w16="http://schemas.microsoft.com/office/word/2018/wordml" xmlns:w16sdtdh="http://schemas.microsoft.com/office/word/2020/wordml/sdtdatahash" xmlns:w16sdtfl="http://schemas.microsoft.com/office/word/2024/wordml/sdtformatlock" xmlns:w16se="http://schemas.microsoft.com/office/word/2015/wordml/symex" xmlns:w16du="http://schemas.microsoft.com/office/word/2023/wordml/word16du" xmlns:wne="http://schemas.microsoft.com/office/word/2006/wordml" mc:Ignorable="w14 w15 w16se w16cid w16 w16cex w16sdtdh w16sdtfl w16du wp14">
+<w:numbering xmlns:wpc="http://schemas.microsoft.com/office/word/2010/wordprocessingCanvas" xmlns:cx="http://schemas.microsoft.com/office/drawing/2014/chartex" xmlns:cx1="http://schemas.microsoft.com/office/drawing/2015/9/8/chartex" xmlns:cx2="http://schemas.microsoft.com/office/drawing/2015/10/21/chartex" xmlns:cx3="http://schemas.microsoft.com/office/drawing/2016/5/9/chartex" xmlns:cx4="http://schemas.microsoft.com/office/drawing/2016/5/10/chartex" xmlns:cx5="http://schemas.microsoft.com/office/drawing/2016/5/11/chartex" xmlns:cx6="http://schemas.microsoft.com/office/drawing/2016/5/12/chartex" xmlns:cx7="http://schemas.microsoft.com/office/drawing/2016/5/13/chartex" xmlns:cx8="http://schemas.microsoft.com/office/drawing/2016/5/14/chartex" xmlns:mc="http://schemas.openxmlformats.org/markup-compatibility/2006" xmlns:m="http://schemas.openxmlformats.org/officeDocument/2006/math" xmlns:aink="http://schemas.microsoft.com/office/drawing/2016/ink" xmlns:am3d="http://schemas.microsoft.com/office/drawing/2017/model3d" xmlns:oel="http://schemas.microsoft.com/office/2019/extlst" xmlns:r="http://schemas.openxmlformats.org/officeDocument/2006/relationships" xmlns:wp14="http://schemas.microsoft.com/office/word/2010/wordprocessingDrawing" xmlns:wp="http://schemas.openxmlformats.org/drawingml/2006/wordprocessingDrawing" xmlns:wpg="http://schemas.microsoft.com/office/word/2010/wordprocessingGroup" xmlns:wpi="http://schemas.microsoft.com/office/word/2010/wordprocessingInk" xmlns:wps="http://schemas.microsoft.com/office/word/2010/wordprocessingShape" xmlns:o="urn:schemas-microsoft-com:office:office" xmlns:v="urn:schemas-microsoft-com:vml" xmlns:w10="urn:schemas-microsoft-com:office:word" xmlns:w="http://schemas.openxmlformats.org/wordprocessingml/2006/main" xmlns:w14="http://schemas.microsoft.com/office/word/2010/wordml" xmlns:w15="http://schemas.microsoft.com/office/word/2012/wordml" xmlns:w16cei="http://schemas.microsoft.com/office/word/2026/wordml/cei" xmlns:w16cex="http://schemas.microsoft.com/office/word/2018/wordml/cex" xmlns:w16cid="http://schemas.microsoft.com/office/word/2016/wordml/cid" xmlns:w16="http://schemas.microsoft.com/office/word/2018/wordml" xmlns:w16sdtdh="http://schemas.microsoft.com/office/word/2020/wordml/sdtdatahash" xmlns:w16sdtfl="http://schemas.microsoft.com/office/word/2024/wordml/sdtformatlock" xmlns:w16se="http://schemas.microsoft.com/office/word/2015/wordml/symex" xmlns:w16du="http://schemas.microsoft.com/office/word/2023/wordml/word16du" xmlns:wne="http://schemas.microsoft.com/office/word/2006/wordml" mc:Ignorable="w14 w15 w16se w16cid w16 w16cex w16sdtdh w16sdtfl w16du wp14">
   <w:abstractNum w:abstractNumId="0" w15:restartNumberingAfterBreak="0">
     <w:nsid w:val="B455C341"/>
     <w:multiLevelType w:val="multilevel"/>
@@ -2022,6 +2717,188 @@
     </w:lvl>
   </w:abstractNum>
   <w:abstractNum w:abstractNumId="1" w15:restartNumberingAfterBreak="0">
+    <w:nsid w:val="0000A990"/>
+    <w:multiLevelType w:val="multilevel"/>
+    <w:tmpl w:val="821E4FC2"/>
+    <w:lvl w:ilvl="0">
+      <w:numFmt w:val="bullet"/>
+      <w:lvlText w:val=" "/>
+      <w:lvlJc w:val="left"/>
+      <w:pPr>
+        <w:ind w:left="720" w:hanging="360"/>
+      </w:pPr>
+    </w:lvl>
+    <w:lvl w:ilvl="1">
+      <w:numFmt w:val="bullet"/>
+      <w:lvlText w:val=" "/>
+      <w:lvlJc w:val="left"/>
+      <w:pPr>
+        <w:ind w:left="1440" w:hanging="360"/>
+      </w:pPr>
+    </w:lvl>
+    <w:lvl w:ilvl="2">
+      <w:numFmt w:val="bullet"/>
+      <w:lvlText w:val=" "/>
+      <w:lvlJc w:val="left"/>
+      <w:pPr>
+        <w:ind w:left="2160" w:hanging="360"/>
+      </w:pPr>
+    </w:lvl>
+    <w:lvl w:ilvl="3">
+      <w:numFmt w:val="bullet"/>
+      <w:lvlText w:val=" "/>
+      <w:lvlJc w:val="left"/>
+      <w:pPr>
+        <w:ind w:left="2880" w:hanging="360"/>
+      </w:pPr>
+    </w:lvl>
+    <w:lvl w:ilvl="4">
+      <w:numFmt w:val="bullet"/>
+      <w:lvlText w:val=" "/>
+      <w:lvlJc w:val="left"/>
+      <w:pPr>
+        <w:ind w:left="3600" w:hanging="360"/>
+      </w:pPr>
+    </w:lvl>
+    <w:lvl w:ilvl="5">
+      <w:numFmt w:val="bullet"/>
+      <w:lvlText w:val=" "/>
+      <w:lvlJc w:val="left"/>
+      <w:pPr>
+        <w:ind w:left="4320" w:hanging="360"/>
+      </w:pPr>
+    </w:lvl>
+    <w:lvl w:ilvl="6">
+      <w:numFmt w:val="bullet"/>
+      <w:lvlText w:val=" "/>
+      <w:lvlJc w:val="left"/>
+      <w:pPr>
+        <w:ind w:left="5040" w:hanging="360"/>
+      </w:pPr>
+    </w:lvl>
+    <w:lvl w:ilvl="7">
+      <w:numFmt w:val="bullet"/>
+      <w:lvlText w:val=" "/>
+      <w:lvlJc w:val="left"/>
+      <w:pPr>
+        <w:ind w:left="5760" w:hanging="360"/>
+      </w:pPr>
+    </w:lvl>
+    <w:lvl w:ilvl="8">
+      <w:numFmt w:val="bullet"/>
+      <w:lvlText w:val=" "/>
+      <w:lvlJc w:val="left"/>
+      <w:pPr>
+        <w:ind w:left="6480" w:hanging="360"/>
+      </w:pPr>
+    </w:lvl>
+  </w:abstractNum>
+  <w:abstractNum w:abstractNumId="2" w15:restartNumberingAfterBreak="0">
+    <w:nsid w:val="0000A991"/>
+    <w:multiLevelType w:val="multilevel"/>
+    <w:tmpl w:val="8C1C997E"/>
+    <w:lvl w:ilvl="0">
+      <w:numFmt w:val="bullet"/>
+      <w:pStyle w:val="Compact"/>
+      <w:lvlText w:val=""/>
+      <w:lvlJc w:val="left"/>
+      <w:pPr>
+        <w:ind w:left="720" w:hanging="360"/>
+      </w:pPr>
+      <w:rPr>
+        <w:rFonts w:ascii="Symbol" w:hAnsi="Symbol" w:cs="Symbol" w:hint="default"/>
+      </w:rPr>
+    </w:lvl>
+    <w:lvl w:ilvl="1">
+      <w:numFmt w:val="bullet"/>
+      <w:lvlText w:val="o"/>
+      <w:lvlJc w:val="left"/>
+      <w:pPr>
+        <w:ind w:left="1440" w:hanging="360"/>
+      </w:pPr>
+      <w:rPr>
+        <w:rFonts w:ascii="Courier New" w:hAnsi="Courier New" w:cs="Courier New" w:hint="default"/>
+      </w:rPr>
+    </w:lvl>
+    <w:lvl w:ilvl="2">
+      <w:numFmt w:val="bullet"/>
+      <w:lvlText w:val=""/>
+      <w:lvlJc w:val="left"/>
+      <w:pPr>
+        <w:ind w:left="2160" w:hanging="360"/>
+      </w:pPr>
+      <w:rPr>
+        <w:rFonts w:ascii="Wingdings" w:hAnsi="Wingdings" w:cs="Wingdings" w:hint="default"/>
+      </w:rPr>
+    </w:lvl>
+    <w:lvl w:ilvl="3">
+      <w:numFmt w:val="bullet"/>
+      <w:lvlText w:val=""/>
+      <w:lvlJc w:val="left"/>
+      <w:pPr>
+        <w:ind w:left="2880" w:hanging="360"/>
+      </w:pPr>
+      <w:rPr>
+        <w:rFonts w:ascii="Symbol" w:hAnsi="Symbol" w:cs="Symbol" w:hint="default"/>
+      </w:rPr>
+    </w:lvl>
+    <w:lvl w:ilvl="4">
+      <w:numFmt w:val="bullet"/>
+      <w:lvlText w:val="o"/>
+      <w:lvlJc w:val="left"/>
+      <w:pPr>
+        <w:ind w:left="3600" w:hanging="360"/>
+      </w:pPr>
+      <w:rPr>
+        <w:rFonts w:ascii="Courier New" w:hAnsi="Courier New" w:cs="Courier New" w:hint="default"/>
+      </w:rPr>
+    </w:lvl>
+    <w:lvl w:ilvl="5">
+      <w:numFmt w:val="bullet"/>
+      <w:lvlText w:val=""/>
+      <w:lvlJc w:val="left"/>
+      <w:pPr>
+        <w:ind w:left="4320" w:hanging="360"/>
+      </w:pPr>
+      <w:rPr>
+        <w:rFonts w:ascii="Wingdings" w:hAnsi="Wingdings" w:cs="Wingdings" w:hint="default"/>
+      </w:rPr>
+    </w:lvl>
+    <w:lvl w:ilvl="6">
+      <w:numFmt w:val="bullet"/>
+      <w:lvlText w:val=""/>
+      <w:lvlJc w:val="left"/>
+      <w:pPr>
+        <w:ind w:left="5040" w:hanging="360"/>
+      </w:pPr>
+      <w:rPr>
+        <w:rFonts w:ascii="Symbol" w:hAnsi="Symbol" w:cs="Symbol" w:hint="default"/>
+      </w:rPr>
+    </w:lvl>
+    <w:lvl w:ilvl="7">
+      <w:numFmt w:val="bullet"/>
+      <w:lvlText w:val="o"/>
+      <w:lvlJc w:val="left"/>
+      <w:pPr>
+        <w:ind w:left="5760" w:hanging="360"/>
+      </w:pPr>
+      <w:rPr>
+        <w:rFonts w:ascii="Courier New" w:hAnsi="Courier New" w:cs="Courier New" w:hint="default"/>
+      </w:rPr>
+    </w:lvl>
+    <w:lvl w:ilvl="8">
+      <w:numFmt w:val="bullet"/>
+      <w:lvlText w:val=""/>
+      <w:lvlJc w:val="left"/>
+      <w:pPr>
+        <w:ind w:left="6480" w:hanging="360"/>
+      </w:pPr>
+      <w:rPr>
+        <w:rFonts w:ascii="Wingdings" w:hAnsi="Wingdings" w:cs="Wingdings" w:hint="default"/>
+      </w:rPr>
+    </w:lvl>
+  </w:abstractNum>
+  <w:abstractNum w:abstractNumId="3" w15:restartNumberingAfterBreak="0">
     <w:nsid w:val="01C04ED9"/>
     <w:multiLevelType w:val="multilevel"/>
     <w:tmpl w:val="26807968"/>
@@ -2119,7 +2996,7 @@
       <w:lvlJc w:val="left"/>
     </w:lvl>
   </w:abstractNum>
-  <w:abstractNum w:abstractNumId="2" w15:restartNumberingAfterBreak="0">
+  <w:abstractNum w:abstractNumId="4" w15:restartNumberingAfterBreak="0">
     <w:nsid w:val="044A3D75"/>
     <w:multiLevelType w:val="hybridMultilevel"/>
     <w:tmpl w:val="E090ABCC"/>
@@ -2234,7 +3111,7 @@
       </w:rPr>
     </w:lvl>
   </w:abstractNum>
-  <w:abstractNum w:abstractNumId="3" w15:restartNumberingAfterBreak="0">
+  <w:abstractNum w:abstractNumId="5" w15:restartNumberingAfterBreak="0">
     <w:nsid w:val="04987C3E"/>
     <w:multiLevelType w:val="hybridMultilevel"/>
     <w:tmpl w:val="74A8C594"/>
@@ -2349,7 +3226,7 @@
       </w:rPr>
     </w:lvl>
   </w:abstractNum>
-  <w:abstractNum w:abstractNumId="4" w15:restartNumberingAfterBreak="0">
+  <w:abstractNum w:abstractNumId="6" w15:restartNumberingAfterBreak="0">
     <w:nsid w:val="0DAC3FC2"/>
     <w:multiLevelType w:val="hybridMultilevel"/>
     <w:tmpl w:val="C92A0BFA"/>
@@ -2438,7 +3315,7 @@
       </w:pPr>
     </w:lvl>
   </w:abstractNum>
-  <w:abstractNum w:abstractNumId="5" w15:restartNumberingAfterBreak="0">
+  <w:abstractNum w:abstractNumId="7" w15:restartNumberingAfterBreak="0">
     <w:nsid w:val="12946667"/>
     <w:multiLevelType w:val="hybridMultilevel"/>
     <w:tmpl w:val="5EA8BA1E"/>
@@ -2528,7 +3405,7 @@
       </w:pPr>
     </w:lvl>
   </w:abstractNum>
-  <w:abstractNum w:abstractNumId="6" w15:restartNumberingAfterBreak="0">
+  <w:abstractNum w:abstractNumId="8" w15:restartNumberingAfterBreak="0">
     <w:nsid w:val="148B56F7"/>
     <w:multiLevelType w:val="hybridMultilevel"/>
     <w:tmpl w:val="6F3CC09A"/>
@@ -2652,7 +3529,7 @@
       </w:rPr>
     </w:lvl>
   </w:abstractNum>
-  <w:abstractNum w:abstractNumId="7" w15:restartNumberingAfterBreak="0">
+  <w:abstractNum w:abstractNumId="9" w15:restartNumberingAfterBreak="0">
     <w:nsid w:val="1831483D"/>
     <w:multiLevelType w:val="multilevel"/>
     <w:tmpl w:val="23CEF48A"/>
@@ -2750,7 +3627,7 @@
       <w:lvlJc w:val="left"/>
     </w:lvl>
   </w:abstractNum>
-  <w:abstractNum w:abstractNumId="8" w15:restartNumberingAfterBreak="0">
+  <w:abstractNum w:abstractNumId="10" w15:restartNumberingAfterBreak="0">
     <w:nsid w:val="1A392C21"/>
     <w:multiLevelType w:val="hybridMultilevel"/>
     <w:tmpl w:val="5E8EF64A"/>
@@ -2843,7 +3720,7 @@
       </w:pPr>
     </w:lvl>
   </w:abstractNum>
-  <w:abstractNum w:abstractNumId="9" w15:restartNumberingAfterBreak="0">
+  <w:abstractNum w:abstractNumId="11" w15:restartNumberingAfterBreak="0">
     <w:nsid w:val="1A683556"/>
     <w:multiLevelType w:val="hybridMultilevel"/>
     <w:tmpl w:val="A03CB8DA"/>
@@ -2956,7 +3833,7 @@
       </w:rPr>
     </w:lvl>
   </w:abstractNum>
-  <w:abstractNum w:abstractNumId="10" w15:restartNumberingAfterBreak="0">
+  <w:abstractNum w:abstractNumId="12" w15:restartNumberingAfterBreak="0">
     <w:nsid w:val="1CCD140B"/>
     <w:multiLevelType w:val="hybridMultilevel"/>
     <w:tmpl w:val="3F8AE48C"/>
@@ -3072,7 +3949,7 @@
       </w:rPr>
     </w:lvl>
   </w:abstractNum>
-  <w:abstractNum w:abstractNumId="11" w15:restartNumberingAfterBreak="0">
+  <w:abstractNum w:abstractNumId="13" w15:restartNumberingAfterBreak="0">
     <w:nsid w:val="22D73C3C"/>
     <w:multiLevelType w:val="hybridMultilevel"/>
     <w:tmpl w:val="E25C7A0A"/>
@@ -3286,7 +4163,7 @@
       </w:rPr>
     </w:lvl>
   </w:abstractNum>
-  <w:abstractNum w:abstractNumId="12" w15:restartNumberingAfterBreak="0">
+  <w:abstractNum w:abstractNumId="14" w15:restartNumberingAfterBreak="0">
     <w:nsid w:val="25BE2B0A"/>
     <w:multiLevelType w:val="hybridMultilevel"/>
     <w:tmpl w:val="C52A818A"/>
@@ -3377,7 +4254,7 @@
       </w:pPr>
     </w:lvl>
   </w:abstractNum>
-  <w:abstractNum w:abstractNumId="13" w15:restartNumberingAfterBreak="0">
+  <w:abstractNum w:abstractNumId="15" w15:restartNumberingAfterBreak="0">
     <w:nsid w:val="28B968A7"/>
     <w:multiLevelType w:val="hybridMultilevel"/>
     <w:tmpl w:val="9C865630"/>
@@ -3491,7 +4368,7 @@
       </w:rPr>
     </w:lvl>
   </w:abstractNum>
-  <w:abstractNum w:abstractNumId="14" w15:restartNumberingAfterBreak="0">
+  <w:abstractNum w:abstractNumId="16" w15:restartNumberingAfterBreak="0">
     <w:nsid w:val="31344998"/>
     <w:multiLevelType w:val="hybridMultilevel"/>
     <w:tmpl w:val="902C661C"/>
@@ -3611,7 +4488,7 @@
       </w:rPr>
     </w:lvl>
   </w:abstractNum>
-  <w:abstractNum w:abstractNumId="15" w15:restartNumberingAfterBreak="0">
+  <w:abstractNum w:abstractNumId="17" w15:restartNumberingAfterBreak="0">
     <w:nsid w:val="330A3796"/>
     <w:multiLevelType w:val="hybridMultilevel"/>
     <w:tmpl w:val="76ECAD60"/>
@@ -3724,7 +4601,7 @@
       </w:rPr>
     </w:lvl>
   </w:abstractNum>
-  <w:abstractNum w:abstractNumId="16" w15:restartNumberingAfterBreak="0">
+  <w:abstractNum w:abstractNumId="18" w15:restartNumberingAfterBreak="0">
     <w:nsid w:val="35BD5DD5"/>
     <w:multiLevelType w:val="hybridMultilevel"/>
     <w:tmpl w:val="F77ABAE6"/>
@@ -3839,7 +4716,7 @@
       </w:rPr>
     </w:lvl>
   </w:abstractNum>
-  <w:abstractNum w:abstractNumId="17" w15:restartNumberingAfterBreak="0">
+  <w:abstractNum w:abstractNumId="19" w15:restartNumberingAfterBreak="0">
     <w:nsid w:val="37EE7412"/>
     <w:multiLevelType w:val="hybridMultilevel"/>
     <w:tmpl w:val="CB54E218"/>
@@ -4053,7 +4930,7 @@
       </w:rPr>
     </w:lvl>
   </w:abstractNum>
-  <w:abstractNum w:abstractNumId="18" w15:restartNumberingAfterBreak="0">
+  <w:abstractNum w:abstractNumId="20" w15:restartNumberingAfterBreak="0">
     <w:nsid w:val="3B7C562F"/>
     <w:multiLevelType w:val="hybridMultilevel"/>
     <w:tmpl w:val="7FA206F4"/>
@@ -4170,7 +5047,7 @@
       </w:rPr>
     </w:lvl>
   </w:abstractNum>
-  <w:abstractNum w:abstractNumId="19" w15:restartNumberingAfterBreak="0">
+  <w:abstractNum w:abstractNumId="21" w15:restartNumberingAfterBreak="0">
     <w:nsid w:val="49E7569F"/>
     <w:multiLevelType w:val="hybridMultilevel"/>
     <w:tmpl w:val="6D001996"/>
@@ -4262,7 +5139,7 @@
       </w:pPr>
     </w:lvl>
   </w:abstractNum>
-  <w:abstractNum w:abstractNumId="20" w15:restartNumberingAfterBreak="0">
+  <w:abstractNum w:abstractNumId="22" w15:restartNumberingAfterBreak="0">
     <w:nsid w:val="4B3573AD"/>
     <w:multiLevelType w:val="hybridMultilevel"/>
     <w:tmpl w:val="D92E6F12"/>
@@ -4383,7 +5260,7 @@
       </w:rPr>
     </w:lvl>
   </w:abstractNum>
-  <w:abstractNum w:abstractNumId="21" w15:restartNumberingAfterBreak="0">
+  <w:abstractNum w:abstractNumId="23" w15:restartNumberingAfterBreak="0">
     <w:nsid w:val="50D247D0"/>
     <w:multiLevelType w:val="hybridMultilevel"/>
     <w:tmpl w:val="6166FB42"/>
@@ -4500,7 +5377,7 @@
       </w:rPr>
     </w:lvl>
   </w:abstractNum>
-  <w:abstractNum w:abstractNumId="22" w15:restartNumberingAfterBreak="0">
+  <w:abstractNum w:abstractNumId="24" w15:restartNumberingAfterBreak="0">
     <w:nsid w:val="54741CF7"/>
     <w:multiLevelType w:val="hybridMultilevel"/>
     <w:tmpl w:val="F0EAC25E"/>
@@ -4613,7 +5490,7 @@
       </w:rPr>
     </w:lvl>
   </w:abstractNum>
-  <w:abstractNum w:abstractNumId="23" w15:restartNumberingAfterBreak="0">
+  <w:abstractNum w:abstractNumId="25" w15:restartNumberingAfterBreak="0">
     <w:nsid w:val="54796D7F"/>
     <w:multiLevelType w:val="hybridMultilevel"/>
     <w:tmpl w:val="1DB02BD4"/>
@@ -4827,7 +5704,7 @@
       </w:rPr>
     </w:lvl>
   </w:abstractNum>
-  <w:abstractNum w:abstractNumId="24" w15:restartNumberingAfterBreak="0">
+  <w:abstractNum w:abstractNumId="26" w15:restartNumberingAfterBreak="0">
     <w:nsid w:val="550B5D70"/>
     <w:multiLevelType w:val="multilevel"/>
     <w:tmpl w:val="B4E41376"/>
@@ -4925,7 +5802,7 @@
       <w:lvlJc w:val="left"/>
     </w:lvl>
   </w:abstractNum>
-  <w:abstractNum w:abstractNumId="25" w15:restartNumberingAfterBreak="0">
+  <w:abstractNum w:abstractNumId="27" w15:restartNumberingAfterBreak="0">
     <w:nsid w:val="55EE46DA"/>
     <w:multiLevelType w:val="hybridMultilevel"/>
     <w:tmpl w:val="BCB4EAF8"/>
@@ -5040,7 +5917,7 @@
       </w:rPr>
     </w:lvl>
   </w:abstractNum>
-  <w:abstractNum w:abstractNumId="26" w15:restartNumberingAfterBreak="0">
+  <w:abstractNum w:abstractNumId="28" w15:restartNumberingAfterBreak="0">
     <w:nsid w:val="56C21714"/>
     <w:multiLevelType w:val="hybridMultilevel"/>
     <w:tmpl w:val="1C381334"/>
@@ -5160,7 +6037,7 @@
       </w:rPr>
     </w:lvl>
   </w:abstractNum>
-  <w:abstractNum w:abstractNumId="27" w15:restartNumberingAfterBreak="0">
+  <w:abstractNum w:abstractNumId="29" w15:restartNumberingAfterBreak="0">
     <w:nsid w:val="5AC1617B"/>
     <w:multiLevelType w:val="hybridMultilevel"/>
     <w:tmpl w:val="1F9CF6D8"/>
@@ -5286,7 +6163,7 @@
       </w:rPr>
     </w:lvl>
   </w:abstractNum>
-  <w:abstractNum w:abstractNumId="28" w15:restartNumberingAfterBreak="0">
+  <w:abstractNum w:abstractNumId="30" w15:restartNumberingAfterBreak="0">
     <w:nsid w:val="631E3CF8"/>
     <w:multiLevelType w:val="hybridMultilevel"/>
     <w:tmpl w:val="C096EF6A"/>
@@ -5376,7 +6253,7 @@
       </w:pPr>
     </w:lvl>
   </w:abstractNum>
-  <w:abstractNum w:abstractNumId="29" w15:restartNumberingAfterBreak="0">
+  <w:abstractNum w:abstractNumId="31" w15:restartNumberingAfterBreak="0">
     <w:nsid w:val="67C54D4B"/>
     <w:multiLevelType w:val="hybridMultilevel"/>
     <w:tmpl w:val="A7760210"/>
@@ -5496,7 +6373,7 @@
       </w:rPr>
     </w:lvl>
   </w:abstractNum>
-  <w:abstractNum w:abstractNumId="30" w15:restartNumberingAfterBreak="0">
+  <w:abstractNum w:abstractNumId="32" w15:restartNumberingAfterBreak="0">
     <w:nsid w:val="6CF67B3B"/>
     <w:multiLevelType w:val="multilevel"/>
     <w:tmpl w:val="D1B6B0D8"/>
@@ -5594,7 +6471,7 @@
       <w:lvlJc w:val="left"/>
     </w:lvl>
   </w:abstractNum>
-  <w:abstractNum w:abstractNumId="31" w15:restartNumberingAfterBreak="0">
+  <w:abstractNum w:abstractNumId="33" w15:restartNumberingAfterBreak="0">
     <w:nsid w:val="72044117"/>
     <w:multiLevelType w:val="hybridMultilevel"/>
     <w:tmpl w:val="91F03070"/>
@@ -5684,7 +6561,7 @@
       </w:pPr>
     </w:lvl>
   </w:abstractNum>
-  <w:abstractNum w:abstractNumId="32" w15:restartNumberingAfterBreak="0">
+  <w:abstractNum w:abstractNumId="34" w15:restartNumberingAfterBreak="0">
     <w:nsid w:val="759474E8"/>
     <w:multiLevelType w:val="hybridMultilevel"/>
     <w:tmpl w:val="A96E61DC"/>
@@ -5773,7 +6650,7 @@
       </w:pPr>
     </w:lvl>
   </w:abstractNum>
-  <w:abstractNum w:abstractNumId="33" w15:restartNumberingAfterBreak="0">
+  <w:abstractNum w:abstractNumId="35" w15:restartNumberingAfterBreak="0">
     <w:nsid w:val="766F4EB0"/>
     <w:multiLevelType w:val="hybridMultilevel"/>
     <w:tmpl w:val="FA8C71E8"/>
@@ -5894,7 +6771,7 @@
       </w:rPr>
     </w:lvl>
   </w:abstractNum>
-  <w:abstractNum w:abstractNumId="34" w15:restartNumberingAfterBreak="0">
+  <w:abstractNum w:abstractNumId="36" w15:restartNumberingAfterBreak="0">
     <w:nsid w:val="7A2F2215"/>
     <w:multiLevelType w:val="hybridMultilevel"/>
     <w:tmpl w:val="67D26144"/>
@@ -6008,115 +6885,124 @@
     </w:lvl>
   </w:abstractNum>
   <w:num w:numId="1" w16cid:durableId="1232809915">
-    <w:abstractNumId w:val="15"/>
+    <w:abstractNumId w:val="17"/>
   </w:num>
   <w:num w:numId="2" w16cid:durableId="632105287">
-    <w:abstractNumId w:val="9"/>
+    <w:abstractNumId w:val="11"/>
   </w:num>
   <w:num w:numId="3" w16cid:durableId="712844753">
-    <w:abstractNumId w:val="3"/>
+    <w:abstractNumId w:val="5"/>
   </w:num>
   <w:num w:numId="4" w16cid:durableId="1656950136">
     <w:abstractNumId w:val="0"/>
   </w:num>
   <w:num w:numId="5" w16cid:durableId="624233240">
+    <w:abstractNumId w:val="3"/>
+  </w:num>
+  <w:num w:numId="6" w16cid:durableId="1656296525">
+    <w:abstractNumId w:val="9"/>
+  </w:num>
+  <w:num w:numId="7" w16cid:durableId="1743137740">
+    <w:abstractNumId w:val="32"/>
+  </w:num>
+  <w:num w:numId="8" w16cid:durableId="1441683422">
+    <w:abstractNumId w:val="26"/>
+  </w:num>
+  <w:num w:numId="9" w16cid:durableId="1346591669">
+    <w:abstractNumId w:val="27"/>
+  </w:num>
+  <w:num w:numId="10" w16cid:durableId="1172141746">
+    <w:abstractNumId w:val="24"/>
+  </w:num>
+  <w:num w:numId="11" w16cid:durableId="1151947565">
+    <w:abstractNumId w:val="20"/>
+  </w:num>
+  <w:num w:numId="12" w16cid:durableId="1539509613">
+    <w:abstractNumId w:val="23"/>
+  </w:num>
+  <w:num w:numId="13" w16cid:durableId="616255005">
+    <w:abstractNumId w:val="34"/>
+  </w:num>
+  <w:num w:numId="14" w16cid:durableId="684941011">
+    <w:abstractNumId w:val="6"/>
+  </w:num>
+  <w:num w:numId="15" w16cid:durableId="1130778624">
+    <w:abstractNumId w:val="12"/>
+  </w:num>
+  <w:num w:numId="16" w16cid:durableId="100995807">
+    <w:abstractNumId w:val="21"/>
+  </w:num>
+  <w:num w:numId="17" w16cid:durableId="120535820">
+    <w:abstractNumId w:val="14"/>
+  </w:num>
+  <w:num w:numId="18" w16cid:durableId="71969155">
+    <w:abstractNumId w:val="22"/>
+  </w:num>
+  <w:num w:numId="19" w16cid:durableId="799301217">
+    <w:abstractNumId w:val="35"/>
+  </w:num>
+  <w:num w:numId="20" w16cid:durableId="1836022915">
+    <w:abstractNumId w:val="36"/>
+  </w:num>
+  <w:num w:numId="21" w16cid:durableId="944456116">
+    <w:abstractNumId w:val="16"/>
+  </w:num>
+  <w:num w:numId="22" w16cid:durableId="513809156">
+    <w:abstractNumId w:val="28"/>
+  </w:num>
+  <w:num w:numId="23" w16cid:durableId="429470865">
+    <w:abstractNumId w:val="18"/>
+  </w:num>
+  <w:num w:numId="24" w16cid:durableId="1551838634">
+    <w:abstractNumId w:val="10"/>
+  </w:num>
+  <w:num w:numId="25" w16cid:durableId="1994024615">
+    <w:abstractNumId w:val="33"/>
+  </w:num>
+  <w:num w:numId="26" w16cid:durableId="97530209">
+    <w:abstractNumId w:val="7"/>
+  </w:num>
+  <w:num w:numId="27" w16cid:durableId="2045516502">
+    <w:abstractNumId w:val="30"/>
+  </w:num>
+  <w:num w:numId="28" w16cid:durableId="645739292">
+    <w:abstractNumId w:val="4"/>
+  </w:num>
+  <w:num w:numId="29" w16cid:durableId="139732602">
+    <w:abstractNumId w:val="15"/>
+  </w:num>
+  <w:num w:numId="30" w16cid:durableId="2000648194">
+    <w:abstractNumId w:val="31"/>
+  </w:num>
+  <w:num w:numId="31" w16cid:durableId="133986227">
+    <w:abstractNumId w:val="8"/>
+  </w:num>
+  <w:num w:numId="32" w16cid:durableId="227233131">
+    <w:abstractNumId w:val="25"/>
+  </w:num>
+  <w:num w:numId="33" w16cid:durableId="1321471397">
+    <w:abstractNumId w:val="13"/>
+  </w:num>
+  <w:num w:numId="34" w16cid:durableId="527912720">
+    <w:abstractNumId w:val="19"/>
+  </w:num>
+  <w:num w:numId="35" w16cid:durableId="998463730">
+    <w:abstractNumId w:val="29"/>
+  </w:num>
+  <w:num w:numId="36" w16cid:durableId="2103529750">
+    <w:abstractNumId w:val="20"/>
+  </w:num>
+  <w:num w:numId="37" w16cid:durableId="824779347">
+    <w:abstractNumId w:val="20"/>
+  </w:num>
+  <w:num w:numId="38" w16cid:durableId="1474637741">
     <w:abstractNumId w:val="1"/>
   </w:num>
-  <w:num w:numId="6" w16cid:durableId="1656296525">
-    <w:abstractNumId w:val="7"/>
-  </w:num>
-  <w:num w:numId="7" w16cid:durableId="1743137740">
-    <w:abstractNumId w:val="30"/>
-  </w:num>
-  <w:num w:numId="8" w16cid:durableId="1441683422">
-    <w:abstractNumId w:val="24"/>
-  </w:num>
-  <w:num w:numId="9" w16cid:durableId="1346591669">
-    <w:abstractNumId w:val="25"/>
-  </w:num>
-  <w:num w:numId="10" w16cid:durableId="1172141746">
-    <w:abstractNumId w:val="22"/>
-  </w:num>
-  <w:num w:numId="11" w16cid:durableId="1151947565">
-    <w:abstractNumId w:val="18"/>
-  </w:num>
-  <w:num w:numId="12" w16cid:durableId="1539509613">
-    <w:abstractNumId w:val="21"/>
-  </w:num>
-  <w:num w:numId="13" w16cid:durableId="616255005">
-    <w:abstractNumId w:val="32"/>
-  </w:num>
-  <w:num w:numId="14" w16cid:durableId="684941011">
-    <w:abstractNumId w:val="4"/>
-  </w:num>
-  <w:num w:numId="15" w16cid:durableId="1130778624">
-    <w:abstractNumId w:val="10"/>
-  </w:num>
-  <w:num w:numId="16" w16cid:durableId="100995807">
-    <w:abstractNumId w:val="19"/>
-  </w:num>
-  <w:num w:numId="17" w16cid:durableId="120535820">
-    <w:abstractNumId w:val="12"/>
-  </w:num>
-  <w:num w:numId="18" w16cid:durableId="71969155">
-    <w:abstractNumId w:val="20"/>
-  </w:num>
-  <w:num w:numId="19" w16cid:durableId="799301217">
-    <w:abstractNumId w:val="33"/>
-  </w:num>
-  <w:num w:numId="20" w16cid:durableId="1836022915">
-    <w:abstractNumId w:val="34"/>
-  </w:num>
-  <w:num w:numId="21" w16cid:durableId="944456116">
-    <w:abstractNumId w:val="14"/>
-  </w:num>
-  <w:num w:numId="22" w16cid:durableId="513809156">
-    <w:abstractNumId w:val="26"/>
-  </w:num>
-  <w:num w:numId="23" w16cid:durableId="429470865">
-    <w:abstractNumId w:val="16"/>
-  </w:num>
-  <w:num w:numId="24" w16cid:durableId="1551838634">
-    <w:abstractNumId w:val="8"/>
-  </w:num>
-  <w:num w:numId="25" w16cid:durableId="1994024615">
-    <w:abstractNumId w:val="31"/>
-  </w:num>
-  <w:num w:numId="26" w16cid:durableId="97530209">
-    <w:abstractNumId w:val="5"/>
-  </w:num>
-  <w:num w:numId="27" w16cid:durableId="2045516502">
-    <w:abstractNumId w:val="28"/>
-  </w:num>
-  <w:num w:numId="28" w16cid:durableId="645739292">
+  <w:num w:numId="39" w16cid:durableId="558828393">
     <w:abstractNumId w:val="2"/>
   </w:num>
-  <w:num w:numId="29" w16cid:durableId="139732602">
-    <w:abstractNumId w:val="13"/>
-  </w:num>
-  <w:num w:numId="30" w16cid:durableId="2000648194">
-    <w:abstractNumId w:val="29"/>
-  </w:num>
-  <w:num w:numId="31" w16cid:durableId="133986227">
-    <w:abstractNumId w:val="6"/>
-  </w:num>
-  <w:num w:numId="32" w16cid:durableId="227233131">
-    <w:abstractNumId w:val="23"/>
-  </w:num>
-  <w:num w:numId="33" w16cid:durableId="1321471397">
-    <w:abstractNumId w:val="11"/>
-  </w:num>
-  <w:num w:numId="34" w16cid:durableId="527912720">
-    <w:abstractNumId w:val="17"/>
-  </w:num>
-  <w:num w:numId="35" w16cid:durableId="998463730">
-    <w:abstractNumId w:val="27"/>
-  </w:num>
-  <w:num w:numId="36" w16cid:durableId="2103529750">
-    <w:abstractNumId w:val="18"/>
-  </w:num>
-  <w:num w:numId="37" w16cid:durableId="824779347">
-    <w:abstractNumId w:val="18"/>
+  <w:num w:numId="40" w16cid:durableId="288821908">
+    <w:abstractNumId w:val="2"/>
   </w:num>
 </w:numbering>
 </file>
@@ -6129,7 +7015,7 @@
         <w:rFonts w:asciiTheme="minorHAnsi" w:eastAsiaTheme="minorHAnsi" w:hAnsiTheme="minorHAnsi" w:cstheme="minorBidi"/>
         <w:sz w:val="22"/>
         <w:szCs w:val="22"/>
-        <w:lang w:val="en-GB" w:eastAsia="en-US" w:bidi="ar-SA"/>
+        <w:lang w:val="cs" w:eastAsia="en-US" w:bidi="ar-SA"/>
       </w:rPr>
     </w:rPrDefault>
     <w:pPrDefault>
@@ -6525,7 +7411,6 @@
     </w:pPr>
     <w:rPr>
       <w:rFonts w:ascii="Georgia" w:hAnsi="Georgia"/>
-      <w:lang w:val="cs-CZ"/>
     </w:rPr>
   </w:style>
   <w:style w:type="paragraph" w:styleId="Heading1">
@@ -6545,7 +7430,6 @@
     <w:rPr>
       <w:b/>
       <w:sz w:val="28"/>
-      <w:lang w:val="cs-CZ"/>
     </w:rPr>
   </w:style>
   <w:style w:type="paragraph" w:styleId="Heading2">
@@ -6595,7 +7479,6 @@
       <w:bCs/>
       <w:color w:val="2526A9"/>
       <w:szCs w:val="28"/>
-      <w:lang w:val="en-US"/>
     </w:rPr>
   </w:style>
   <w:style w:type="paragraph" w:styleId="Heading4">
@@ -6618,13 +7501,11 @@
       <w:bCs/>
       <w:color w:val="4472C4" w:themeColor="accent1"/>
       <w:szCs w:val="24"/>
-      <w:lang w:val="en-US"/>
     </w:rPr>
   </w:style>
   <w:style w:type="character" w:default="1" w:styleId="DefaultParagraphFont">
     <w:name w:val="Default Paragraph Font"/>
     <w:uiPriority w:val="1"/>
-    <w:semiHidden/>
     <w:unhideWhenUsed/>
   </w:style>
   <w:style w:type="table" w:default="1" w:styleId="TableNormal">
@@ -6753,7 +7634,6 @@
     <w:rPr>
       <w:rFonts w:ascii="Times New Roman" w:eastAsia="Times New Roman" w:hAnsi="Times New Roman" w:cs="Times New Roman"/>
       <w:szCs w:val="24"/>
-      <w:lang w:val="en-US"/>
     </w:rPr>
   </w:style>
   <w:style w:type="character" w:styleId="CommentReference">
@@ -6901,27 +7781,15 @@
     <w:name w:val="Body Text"/>
     <w:basedOn w:val="Normal"/>
     <w:link w:val="BodyTextChar"/>
-    <w:rsid w:val="00A56A7D"/>
-    <w:pPr>
-      <w:spacing w:after="120"/>
-      <w:jc w:val="both"/>
-    </w:pPr>
-    <w:rPr>
-      <w:rFonts w:eastAsia="SimSun" w:cs="Times New Roman"/>
-      <w:szCs w:val="24"/>
-      <w:lang w:eastAsia="en-GB" w:bidi="ar-AE"/>
-    </w:rPr>
+    <w:rsid w:val="008B491F"/>
   </w:style>
   <w:style w:type="character" w:customStyle="1" w:styleId="BodyTextChar">
     <w:name w:val="Body Text Char"/>
     <w:basedOn w:val="DefaultParagraphFont"/>
     <w:link w:val="BodyText"/>
-    <w:rsid w:val="00A56A7D"/>
+    <w:rsid w:val="008B491F"/>
     <w:rPr>
-      <w:rFonts w:ascii="Georgia" w:eastAsia="SimSun" w:hAnsi="Georgia" w:cs="Times New Roman"/>
-      <w:sz w:val="24"/>
-      <w:szCs w:val="24"/>
-      <w:lang w:eastAsia="en-GB" w:bidi="ar-AE"/>
+      <w:rFonts w:ascii="Georgia" w:hAnsi="Georgia"/>
     </w:rPr>
   </w:style>
   <w:style w:type="character" w:customStyle="1" w:styleId="Nevyeenzmnka1">
@@ -6949,7 +7817,7 @@
       <w:color w:val="2526A9"/>
       <w:sz w:val="24"/>
       <w:szCs w:val="28"/>
-      <w:lang w:val="en-US"/>
+      <w:lang w:val="cs"/>
     </w:rPr>
   </w:style>
   <w:style w:type="character" w:customStyle="1" w:styleId="Heading4Char">
@@ -6965,35 +7833,25 @@
       <w:color w:val="4472C4" w:themeColor="accent1"/>
       <w:sz w:val="24"/>
       <w:szCs w:val="24"/>
-      <w:lang w:val="en-US"/>
+      <w:lang w:val="cs"/>
     </w:rPr>
   </w:style>
   <w:style w:type="paragraph" w:customStyle="1" w:styleId="FirstParagraph">
     <w:name w:val="First Paragraph"/>
-    <w:basedOn w:val="BodyText"/>
+    <w:basedOn w:val="Normal"/>
     <w:next w:val="BodyText"/>
-    <w:rsid w:val="00D47753"/>
-    <w:pPr>
-      <w:spacing w:before="180" w:after="180" w:line="240" w:lineRule="auto"/>
-      <w:jc w:val="left"/>
-    </w:pPr>
-    <w:rPr>
-      <w:rFonts w:asciiTheme="minorHAnsi" w:eastAsiaTheme="minorHAnsi" w:hAnsiTheme="minorHAnsi" w:cstheme="minorBidi"/>
-      <w:lang w:val="en-US" w:eastAsia="en-US" w:bidi="ar-SA"/>
-    </w:rPr>
+    <w:rsid w:val="008B491F"/>
   </w:style>
   <w:style w:type="paragraph" w:customStyle="1" w:styleId="Compact">
     <w:name w:val="Compact"/>
     <w:basedOn w:val="BodyText"/>
-    <w:rsid w:val="00D47753"/>
+    <w:rsid w:val="008B491F"/>
     <w:pPr>
+      <w:numPr>
+        <w:numId w:val="40"/>
+      </w:numPr>
       <w:spacing w:before="36" w:after="36" w:line="240" w:lineRule="auto"/>
-      <w:jc w:val="left"/>
     </w:pPr>
-    <w:rPr>
-      <w:rFonts w:asciiTheme="minorHAnsi" w:eastAsiaTheme="minorHAnsi" w:hAnsiTheme="minorHAnsi" w:cstheme="minorBidi"/>
-      <w:lang w:val="en-US" w:eastAsia="en-US" w:bidi="ar-SA"/>
-    </w:rPr>
   </w:style>
   <w:style w:type="paragraph" w:styleId="Caption">
     <w:name w:val="caption"/>
@@ -7035,7 +7893,7 @@
       <w:color w:val="2526A9"/>
       <w:sz w:val="28"/>
       <w:szCs w:val="28"/>
-      <w:lang w:val="cs-CZ"/>
+      <w:lang w:val="cs"/>
     </w:rPr>
   </w:style>
   <w:style w:type="character" w:customStyle="1" w:styleId="Heading2Char">
@@ -7052,7 +7910,7 @@
       <w:color w:val="2526A9"/>
       <w:sz w:val="24"/>
       <w:szCs w:val="24"/>
-      <w:lang w:val="cs-CZ"/>
+      <w:lang w:val="cs"/>
     </w:rPr>
   </w:style>
   <w:style w:type="paragraph" w:customStyle="1" w:styleId="IDEAseznam">
@@ -7094,7 +7952,7 @@
       <w:rFonts w:ascii="Georgia" w:eastAsia="Calibri" w:hAnsi="Georgia" w:cs="Times New Roman"/>
       <w:sz w:val="20"/>
       <w:szCs w:val="20"/>
-      <w:lang w:val="cs-CZ"/>
+      <w:lang w:val="cs"/>
     </w:rPr>
   </w:style>
   <w:style w:type="paragraph" w:customStyle="1" w:styleId="Pa35">
@@ -7160,7 +8018,6 @@
     <w:rPr>
       <w:rFonts w:ascii="Georgia" w:hAnsi="Georgia"/>
       <w:sz w:val="24"/>
-      <w:lang w:val="cs-CZ"/>
     </w:rPr>
   </w:style>
   <w:style w:type="paragraph" w:styleId="NormalWeb">
@@ -7176,7 +8033,6 @@
     <w:rPr>
       <w:rFonts w:ascii="Times New Roman" w:eastAsia="Times New Roman" w:hAnsi="Times New Roman" w:cs="Times New Roman"/>
       <w:szCs w:val="24"/>
-      <w:lang w:val="en-US"/>
     </w:rPr>
   </w:style>
   <w:style w:type="table" w:styleId="TableGrid">
@@ -7225,7 +8081,7 @@
       <w:rFonts w:ascii="Georgia" w:hAnsi="Georgia"/>
       <w:sz w:val="20"/>
       <w:szCs w:val="20"/>
-      <w:lang w:val="cs-CZ"/>
+      <w:lang w:val="cs"/>
     </w:rPr>
   </w:style>
   <w:style w:type="character" w:styleId="EndnoteReference">
@@ -7265,7 +8121,6 @@
       <w:rFonts w:ascii="Georgia" w:hAnsi="Georgia"/>
       <w:sz w:val="48"/>
       <w:szCs w:val="48"/>
-      <w:lang w:val="cs-CZ"/>
     </w:rPr>
   </w:style>
   <w:style w:type="paragraph" w:customStyle="1" w:styleId="Nadpis2">
@@ -7351,6 +8206,256 @@
     <w:rPr>
       <w:noProof/>
       <w:szCs w:val="32"/>
+    </w:rPr>
+  </w:style>
+  <w:style w:type="paragraph" w:customStyle="1" w:styleId="SourceCode">
+    <w:name w:val="Source Code"/>
+    <w:basedOn w:val="Normal"/>
+    <w:pPr>
+      <w:shd w:val="clear" w:color="auto" w:fill="F1F3F5"/>
+      <w:wordWrap w:val="0"/>
+    </w:pPr>
+  </w:style>
+  <w:style w:type="character" w:customStyle="1" w:styleId="KeywordTok">
+    <w:name w:val="KeywordTok"/>
+    <w:rPr>
+      <w:b/>
+      <w:color w:val="003B4F"/>
+      <w:shd w:val="clear" w:color="auto" w:fill="F1F3F5"/>
+    </w:rPr>
+  </w:style>
+  <w:style w:type="character" w:customStyle="1" w:styleId="DataTypeTok">
+    <w:name w:val="DataTypeTok"/>
+    <w:rPr>
+      <w:color w:val="AD0000"/>
+      <w:shd w:val="clear" w:color="auto" w:fill="F1F3F5"/>
+    </w:rPr>
+  </w:style>
+  <w:style w:type="character" w:customStyle="1" w:styleId="DecValTok">
+    <w:name w:val="DecValTok"/>
+    <w:rPr>
+      <w:color w:val="AD0000"/>
+      <w:shd w:val="clear" w:color="auto" w:fill="F1F3F5"/>
+    </w:rPr>
+  </w:style>
+  <w:style w:type="character" w:customStyle="1" w:styleId="BaseNTok">
+    <w:name w:val="BaseNTok"/>
+    <w:rPr>
+      <w:color w:val="AD0000"/>
+      <w:shd w:val="clear" w:color="auto" w:fill="F1F3F5"/>
+    </w:rPr>
+  </w:style>
+  <w:style w:type="character" w:customStyle="1" w:styleId="FloatTok">
+    <w:name w:val="FloatTok"/>
+    <w:rPr>
+      <w:color w:val="AD0000"/>
+      <w:shd w:val="clear" w:color="auto" w:fill="F1F3F5"/>
+    </w:rPr>
+  </w:style>
+  <w:style w:type="character" w:customStyle="1" w:styleId="ConstantTok">
+    <w:name w:val="ConstantTok"/>
+    <w:rPr>
+      <w:color w:val="8F5902"/>
+      <w:shd w:val="clear" w:color="auto" w:fill="F1F3F5"/>
+    </w:rPr>
+  </w:style>
+  <w:style w:type="character" w:customStyle="1" w:styleId="CharTok">
+    <w:name w:val="CharTok"/>
+    <w:rPr>
+      <w:color w:val="20794D"/>
+      <w:shd w:val="clear" w:color="auto" w:fill="F1F3F5"/>
+    </w:rPr>
+  </w:style>
+  <w:style w:type="character" w:customStyle="1" w:styleId="SpecialCharTok">
+    <w:name w:val="SpecialCharTok"/>
+    <w:rPr>
+      <w:color w:val="5E5E5E"/>
+      <w:shd w:val="clear" w:color="auto" w:fill="F1F3F5"/>
+    </w:rPr>
+  </w:style>
+  <w:style w:type="character" w:customStyle="1" w:styleId="StringTok">
+    <w:name w:val="StringTok"/>
+    <w:rPr>
+      <w:color w:val="20794D"/>
+      <w:shd w:val="clear" w:color="auto" w:fill="F1F3F5"/>
+    </w:rPr>
+  </w:style>
+  <w:style w:type="character" w:customStyle="1" w:styleId="VerbatimStringTok">
+    <w:name w:val="VerbatimStringTok"/>
+    <w:rPr>
+      <w:color w:val="20794D"/>
+      <w:shd w:val="clear" w:color="auto" w:fill="F1F3F5"/>
+    </w:rPr>
+  </w:style>
+  <w:style w:type="character" w:customStyle="1" w:styleId="SpecialStringTok">
+    <w:name w:val="SpecialStringTok"/>
+    <w:rPr>
+      <w:color w:val="20794D"/>
+      <w:shd w:val="clear" w:color="auto" w:fill="F1F3F5"/>
+    </w:rPr>
+  </w:style>
+  <w:style w:type="character" w:customStyle="1" w:styleId="ImportTok">
+    <w:name w:val="ImportTok"/>
+    <w:rPr>
+      <w:color w:val="00769E"/>
+      <w:shd w:val="clear" w:color="auto" w:fill="F1F3F5"/>
+    </w:rPr>
+  </w:style>
+  <w:style w:type="character" w:customStyle="1" w:styleId="CommentTok">
+    <w:name w:val="CommentTok"/>
+    <w:rPr>
+      <w:color w:val="5E5E5E"/>
+      <w:shd w:val="clear" w:color="auto" w:fill="F1F3F5"/>
+    </w:rPr>
+  </w:style>
+  <w:style w:type="character" w:customStyle="1" w:styleId="DocumentationTok">
+    <w:name w:val="DocumentationTok"/>
+    <w:rPr>
+      <w:i/>
+      <w:color w:val="5E5E5E"/>
+      <w:shd w:val="clear" w:color="auto" w:fill="F1F3F5"/>
+    </w:rPr>
+  </w:style>
+  <w:style w:type="character" w:customStyle="1" w:styleId="AnnotationTok">
+    <w:name w:val="AnnotationTok"/>
+    <w:rPr>
+      <w:color w:val="5E5E5E"/>
+      <w:shd w:val="clear" w:color="auto" w:fill="F1F3F5"/>
+    </w:rPr>
+  </w:style>
+  <w:style w:type="character" w:customStyle="1" w:styleId="CommentVarTok">
+    <w:name w:val="CommentVarTok"/>
+    <w:rPr>
+      <w:i/>
+      <w:color w:val="5E5E5E"/>
+      <w:shd w:val="clear" w:color="auto" w:fill="F1F3F5"/>
+    </w:rPr>
+  </w:style>
+  <w:style w:type="character" w:customStyle="1" w:styleId="OtherTok">
+    <w:name w:val="OtherTok"/>
+    <w:rPr>
+      <w:color w:val="003B4F"/>
+      <w:shd w:val="clear" w:color="auto" w:fill="F1F3F5"/>
+    </w:rPr>
+  </w:style>
+  <w:style w:type="character" w:customStyle="1" w:styleId="FunctionTok">
+    <w:name w:val="FunctionTok"/>
+    <w:rPr>
+      <w:color w:val="4758AB"/>
+      <w:shd w:val="clear" w:color="auto" w:fill="F1F3F5"/>
+    </w:rPr>
+  </w:style>
+  <w:style w:type="character" w:customStyle="1" w:styleId="VariableTok">
+    <w:name w:val="VariableTok"/>
+    <w:rPr>
+      <w:color w:val="111111"/>
+      <w:shd w:val="clear" w:color="auto" w:fill="F1F3F5"/>
+    </w:rPr>
+  </w:style>
+  <w:style w:type="character" w:customStyle="1" w:styleId="ControlFlowTok">
+    <w:name w:val="ControlFlowTok"/>
+    <w:rPr>
+      <w:b/>
+      <w:color w:val="003B4F"/>
+      <w:shd w:val="clear" w:color="auto" w:fill="F1F3F5"/>
+    </w:rPr>
+  </w:style>
+  <w:style w:type="character" w:customStyle="1" w:styleId="OperatorTok">
+    <w:name w:val="OperatorTok"/>
+    <w:rPr>
+      <w:color w:val="5E5E5E"/>
+      <w:shd w:val="clear" w:color="auto" w:fill="F1F3F5"/>
+    </w:rPr>
+  </w:style>
+  <w:style w:type="character" w:customStyle="1" w:styleId="BuiltInTok">
+    <w:name w:val="BuiltInTok"/>
+    <w:rPr>
+      <w:color w:val="003B4F"/>
+      <w:shd w:val="clear" w:color="auto" w:fill="F1F3F5"/>
+    </w:rPr>
+  </w:style>
+  <w:style w:type="character" w:customStyle="1" w:styleId="ExtensionTok">
+    <w:name w:val="ExtensionTok"/>
+    <w:rPr>
+      <w:color w:val="003B4F"/>
+      <w:shd w:val="clear" w:color="auto" w:fill="F1F3F5"/>
+    </w:rPr>
+  </w:style>
+  <w:style w:type="character" w:customStyle="1" w:styleId="PreprocessorTok">
+    <w:name w:val="PreprocessorTok"/>
+    <w:rPr>
+      <w:color w:val="AD0000"/>
+      <w:shd w:val="clear" w:color="auto" w:fill="F1F3F5"/>
+    </w:rPr>
+  </w:style>
+  <w:style w:type="character" w:customStyle="1" w:styleId="AttributeTok">
+    <w:name w:val="AttributeTok"/>
+    <w:rPr>
+      <w:color w:val="657422"/>
+      <w:shd w:val="clear" w:color="auto" w:fill="F1F3F5"/>
+    </w:rPr>
+  </w:style>
+  <w:style w:type="character" w:customStyle="1" w:styleId="RegionMarkerTok">
+    <w:name w:val="RegionMarkerTok"/>
+    <w:rPr>
+      <w:color w:val="003B4F"/>
+      <w:shd w:val="clear" w:color="auto" w:fill="F1F3F5"/>
+    </w:rPr>
+  </w:style>
+  <w:style w:type="character" w:customStyle="1" w:styleId="InformationTok">
+    <w:name w:val="InformationTok"/>
+    <w:rPr>
+      <w:color w:val="5E5E5E"/>
+      <w:shd w:val="clear" w:color="auto" w:fill="F1F3F5"/>
+    </w:rPr>
+  </w:style>
+  <w:style w:type="character" w:customStyle="1" w:styleId="WarningTok">
+    <w:name w:val="WarningTok"/>
+    <w:rPr>
+      <w:i/>
+      <w:color w:val="5E5E5E"/>
+      <w:shd w:val="clear" w:color="auto" w:fill="F1F3F5"/>
+    </w:rPr>
+  </w:style>
+  <w:style w:type="character" w:customStyle="1" w:styleId="AlertTok">
+    <w:name w:val="AlertTok"/>
+    <w:rPr>
+      <w:color w:val="AD0000"/>
+      <w:shd w:val="clear" w:color="auto" w:fill="F1F3F5"/>
+    </w:rPr>
+  </w:style>
+  <w:style w:type="character" w:customStyle="1" w:styleId="ErrorTok">
+    <w:name w:val="ErrorTok"/>
+    <w:rPr>
+      <w:color w:val="AD0000"/>
+      <w:shd w:val="clear" w:color="auto" w:fill="F1F3F5"/>
+    </w:rPr>
+  </w:style>
+  <w:style w:type="character" w:customStyle="1" w:styleId="NormalTok">
+    <w:name w:val="NormalTok"/>
+    <w:rPr>
+      <w:color w:val="003B4F"/>
+      <w:shd w:val="clear" w:color="auto" w:fill="F1F3F5"/>
+    </w:rPr>
+  </w:style>
+  <w:style w:type="paragraph" w:styleId="Title">
+    <w:name w:val="Title"/>
+    <w:basedOn w:val="IDEATitle"/>
+    <w:next w:val="Normal"/>
+    <w:link w:val="TitleChar"/>
+    <w:uiPriority w:val="10"/>
+    <w:rsid w:val="008B491F"/>
+  </w:style>
+  <w:style w:type="character" w:customStyle="1" w:styleId="TitleChar">
+    <w:name w:val="Title Char"/>
+    <w:basedOn w:val="DefaultParagraphFont"/>
+    <w:link w:val="Title"/>
+    <w:uiPriority w:val="10"/>
+    <w:rsid w:val="008B491F"/>
+    <w:rPr>
+      <w:rFonts w:ascii="Georgia" w:hAnsi="Georgia"/>
+      <w:sz w:val="48"/>
+      <w:szCs w:val="48"/>
     </w:rPr>
   </w:style>
 </w:styles>
@@ -7615,291 +8720,4 @@
     </a:ext>
   </a:extLst>
 </a:theme>
-</file>
-
-<file path=customXml/item1.xml><?xml version="1.0" encoding="utf-8"?>
-<b:Sources xmlns:b="http://schemas.openxmlformats.org/officeDocument/2006/bibliography" xmlns="http://schemas.openxmlformats.org/officeDocument/2006/bibliography" SelectedStyle="\APASixthEditionOfficeOnline.xsl" StyleName="APA" Version="6"/>
-</file>
-
-<file path=customXml/item2.xml><?xml version="1.0" encoding="utf-8"?>
-<ct:contentTypeSchema xmlns:ct="http://schemas.microsoft.com/office/2006/metadata/contentType" xmlns:ma="http://schemas.microsoft.com/office/2006/metadata/properties/metaAttributes" ct:_="" ma:_="" ma:contentTypeName="Dokument" ma:contentTypeID="0x01010062A1C79EA2A0BE43AF15D34ABE93DBC5" ma:contentTypeVersion="12" ma:contentTypeDescription="Vytvoří nový dokument" ma:contentTypeScope="" ma:versionID="514a6d60a5108629667c73fc9e172e67">
-  <xsd:schema xmlns:xsd="http://www.w3.org/2001/XMLSchema" xmlns:xs="http://www.w3.org/2001/XMLSchema" xmlns:p="http://schemas.microsoft.com/office/2006/metadata/properties" xmlns:ns2="22a71077-ce1a-4204-9bb0-58248db92961" xmlns:ns3="9433aa81-25e7-40b1-9af8-9d2e2c2f9881" targetNamespace="http://schemas.microsoft.com/office/2006/metadata/properties" ma:root="true" ma:fieldsID="ccb03d0f45fb6fabc2a55c1abc56c5fe" ns2:_="" ns3:_="">
-    <xsd:import namespace="22a71077-ce1a-4204-9bb0-58248db92961"/>
-    <xsd:import namespace="9433aa81-25e7-40b1-9af8-9d2e2c2f9881"/>
-    <xsd:element name="properties">
-      <xsd:complexType>
-        <xsd:sequence>
-          <xsd:element name="documentManagement">
-            <xsd:complexType>
-              <xsd:all>
-                <xsd:element ref="ns2:MediaServiceMetadata" minOccurs="0"/>
-                <xsd:element ref="ns2:MediaServiceFastMetadata" minOccurs="0"/>
-                <xsd:element ref="ns3:SharedWithUsers" minOccurs="0"/>
-                <xsd:element ref="ns3:SharedWithDetails" minOccurs="0"/>
-                <xsd:element ref="ns2:lcf76f155ced4ddcb4097134ff3c332f" minOccurs="0"/>
-                <xsd:element ref="ns3:TaxCatchAll" minOccurs="0"/>
-                <xsd:element ref="ns2:MediaServiceOCR" minOccurs="0"/>
-                <xsd:element ref="ns2:MediaServiceGenerationTime" minOccurs="0"/>
-                <xsd:element ref="ns2:MediaServiceEventHashCode" minOccurs="0"/>
-                <xsd:element ref="ns2:MediaServiceObjectDetectorVersions" minOccurs="0"/>
-                <xsd:element ref="ns2:MediaServiceSearchProperties" minOccurs="0"/>
-              </xsd:all>
-            </xsd:complexType>
-          </xsd:element>
-        </xsd:sequence>
-      </xsd:complexType>
-    </xsd:element>
-  </xsd:schema>
-  <xsd:schema xmlns:xsd="http://www.w3.org/2001/XMLSchema" xmlns:xs="http://www.w3.org/2001/XMLSchema" xmlns:dms="http://schemas.microsoft.com/office/2006/documentManagement/types" xmlns:pc="http://schemas.microsoft.com/office/infopath/2007/PartnerControls" targetNamespace="22a71077-ce1a-4204-9bb0-58248db92961" elementFormDefault="qualified">
-    <xsd:import namespace="http://schemas.microsoft.com/office/2006/documentManagement/types"/>
-    <xsd:import namespace="http://schemas.microsoft.com/office/infopath/2007/PartnerControls"/>
-    <xsd:element name="MediaServiceMetadata" ma:index="8" nillable="true" ma:displayName="MediaServiceMetadata" ma:hidden="true" ma:internalName="MediaServiceMetadata" ma:readOnly="true">
-      <xsd:simpleType>
-        <xsd:restriction base="dms:Note"/>
-      </xsd:simpleType>
-    </xsd:element>
-    <xsd:element name="MediaServiceFastMetadata" ma:index="9" nillable="true" ma:displayName="MediaServiceFastMetadata" ma:hidden="true" ma:internalName="MediaServiceFastMetadata" ma:readOnly="true">
-      <xsd:simpleType>
-        <xsd:restriction base="dms:Note"/>
-      </xsd:simpleType>
-    </xsd:element>
-    <xsd:element name="lcf76f155ced4ddcb4097134ff3c332f" ma:index="13" nillable="true" ma:taxonomy="true" ma:internalName="lcf76f155ced4ddcb4097134ff3c332f" ma:taxonomyFieldName="MediaServiceImageTags" ma:displayName="Značky obrázků" ma:readOnly="false" ma:fieldId="{5cf76f15-5ced-4ddc-b409-7134ff3c332f}" ma:taxonomyMulti="true" ma:sspId="7705af95-af8b-4274-9321-7e268ee4833a" ma:termSetId="09814cd3-568e-fe90-9814-8d621ff8fb84" ma:anchorId="fba54fb3-c3e1-fe81-a776-ca4b69148c4d" ma:open="true" ma:isKeyword="false">
-      <xsd:complexType>
-        <xsd:sequence>
-          <xsd:element ref="pc:Terms" minOccurs="0" maxOccurs="1"/>
-        </xsd:sequence>
-      </xsd:complexType>
-    </xsd:element>
-    <xsd:element name="MediaServiceOCR" ma:index="15" nillable="true" ma:displayName="Extracted Text" ma:internalName="MediaServiceOCR" ma:readOnly="true">
-      <xsd:simpleType>
-        <xsd:restriction base="dms:Note">
-          <xsd:maxLength value="255"/>
-        </xsd:restriction>
-      </xsd:simpleType>
-    </xsd:element>
-    <xsd:element name="MediaServiceGenerationTime" ma:index="16" nillable="true" ma:displayName="MediaServiceGenerationTime" ma:hidden="true" ma:internalName="MediaServiceGenerationTime" ma:readOnly="true">
-      <xsd:simpleType>
-        <xsd:restriction base="dms:Text"/>
-      </xsd:simpleType>
-    </xsd:element>
-    <xsd:element name="MediaServiceEventHashCode" ma:index="17" nillable="true" ma:displayName="MediaServiceEventHashCode" ma:hidden="true" ma:internalName="MediaServiceEventHashCode" ma:readOnly="true">
-      <xsd:simpleType>
-        <xsd:restriction base="dms:Text"/>
-      </xsd:simpleType>
-    </xsd:element>
-    <xsd:element name="MediaServiceObjectDetectorVersions" ma:index="18" nillable="true" ma:displayName="MediaServiceObjectDetectorVersions" ma:hidden="true" ma:indexed="true" ma:internalName="MediaServiceObjectDetectorVersions" ma:readOnly="true">
-      <xsd:simpleType>
-        <xsd:restriction base="dms:Text"/>
-      </xsd:simpleType>
-    </xsd:element>
-    <xsd:element name="MediaServiceSearchProperties" ma:index="19" nillable="true" ma:displayName="MediaServiceSearchProperties" ma:hidden="true" ma:internalName="MediaServiceSearchProperties" ma:readOnly="true">
-      <xsd:simpleType>
-        <xsd:restriction base="dms:Note"/>
-      </xsd:simpleType>
-    </xsd:element>
-  </xsd:schema>
-  <xsd:schema xmlns:xsd="http://www.w3.org/2001/XMLSchema" xmlns:xs="http://www.w3.org/2001/XMLSchema" xmlns:dms="http://schemas.microsoft.com/office/2006/documentManagement/types" xmlns:pc="http://schemas.microsoft.com/office/infopath/2007/PartnerControls" targetNamespace="9433aa81-25e7-40b1-9af8-9d2e2c2f9881" elementFormDefault="qualified">
-    <xsd:import namespace="http://schemas.microsoft.com/office/2006/documentManagement/types"/>
-    <xsd:import namespace="http://schemas.microsoft.com/office/infopath/2007/PartnerControls"/>
-    <xsd:element name="SharedWithUsers" ma:index="10" nillable="true" ma:displayName="Sdílí se s" ma:internalName="SharedWithUsers" ma:readOnly="true">
-      <xsd:complexType>
-        <xsd:complexContent>
-          <xsd:extension base="dms:UserMulti">
-            <xsd:sequence>
-              <xsd:element name="UserInfo" minOccurs="0" maxOccurs="unbounded">
-                <xsd:complexType>
-                  <xsd:sequence>
-                    <xsd:element name="DisplayName" type="xsd:string" minOccurs="0"/>
-                    <xsd:element name="AccountId" type="dms:UserId" minOccurs="0" nillable="true"/>
-                    <xsd:element name="AccountType" type="xsd:string" minOccurs="0"/>
-                  </xsd:sequence>
-                </xsd:complexType>
-              </xsd:element>
-            </xsd:sequence>
-          </xsd:extension>
-        </xsd:complexContent>
-      </xsd:complexType>
-    </xsd:element>
-    <xsd:element name="SharedWithDetails" ma:index="11" nillable="true" ma:displayName="Sdílené s podrobnostmi" ma:internalName="SharedWithDetails" ma:readOnly="true">
-      <xsd:simpleType>
-        <xsd:restriction base="dms:Note">
-          <xsd:maxLength value="255"/>
-        </xsd:restriction>
-      </xsd:simpleType>
-    </xsd:element>
-    <xsd:element name="TaxCatchAll" ma:index="14" nillable="true" ma:displayName="Taxonomy Catch All Column" ma:hidden="true" ma:list="{afadd978-b980-4c3f-9ce4-bb23cdab39e0}" ma:internalName="TaxCatchAll" ma:showField="CatchAllData" ma:web="9433aa81-25e7-40b1-9af8-9d2e2c2f9881">
-      <xsd:complexType>
-        <xsd:complexContent>
-          <xsd:extension base="dms:MultiChoiceLookup">
-            <xsd:sequence>
-              <xsd:element name="Value" type="dms:Lookup" maxOccurs="unbounded" minOccurs="0" nillable="true"/>
-            </xsd:sequence>
-          </xsd:extension>
-        </xsd:complexContent>
-      </xsd:complexType>
-    </xsd:element>
-  </xsd:schema>
-  <xsd:schema xmlns="http://schemas.openxmlformats.org/package/2006/metadata/core-properties" xmlns:xsd="http://www.w3.org/2001/XMLSchema" xmlns:xsi="http://www.w3.org/2001/XMLSchema-instance" xmlns:dc="http://purl.org/dc/elements/1.1/" xmlns:dcterms="http://purl.org/dc/terms/" xmlns:odoc="http://schemas.microsoft.com/internal/obd" targetNamespace="http://schemas.openxmlformats.org/package/2006/metadata/core-properties" elementFormDefault="qualified" attributeFormDefault="unqualified" blockDefault="#all">
-    <xsd:import namespace="http://purl.org/dc/elements/1.1/" schemaLocation="http://dublincore.org/schemas/xmls/qdc/2003/04/02/dc.xsd"/>
-    <xsd:import namespace="http://purl.org/dc/terms/" schemaLocation="http://dublincore.org/schemas/xmls/qdc/2003/04/02/dcterms.xsd"/>
-    <xsd:element name="coreProperties" type="CT_coreProperties"/>
-    <xsd:complexType name="CT_coreProperties">
-      <xsd:all>
-        <xsd:element ref="dc:creator" minOccurs="0" maxOccurs="1"/>
-        <xsd:element ref="dcterms:created" minOccurs="0" maxOccurs="1"/>
-        <xsd:element ref="dc:identifier" minOccurs="0" maxOccurs="1"/>
-        <xsd:element name="contentType" minOccurs="0" maxOccurs="1" type="xsd:string" ma:index="0" ma:displayName="Typ obsahu"/>
-        <xsd:element ref="dc:title" minOccurs="0" maxOccurs="1" ma:index="4" ma:displayName="Nadpis"/>
-        <xsd:element ref="dc:subject" minOccurs="0" maxOccurs="1"/>
-        <xsd:element ref="dc:description" minOccurs="0" maxOccurs="1"/>
-        <xsd:element name="keywords" minOccurs="0" maxOccurs="1" type="xsd:string"/>
-        <xsd:element ref="dc:language" minOccurs="0" maxOccurs="1"/>
-        <xsd:element name="category" minOccurs="0" maxOccurs="1" type="xsd:string"/>
-        <xsd:element name="version" minOccurs="0" maxOccurs="1" type="xsd:string"/>
-        <xsd:element name="revision" minOccurs="0" maxOccurs="1" type="xsd:string">
-          <xsd:annotation>
-            <xsd:documentation>
-                        This value indicates the number of saves or revisions. The application is responsible for updating this value after each revision.
-                    </xsd:documentation>
-          </xsd:annotation>
-        </xsd:element>
-        <xsd:element name="lastModifiedBy" minOccurs="0" maxOccurs="1" type="xsd:string"/>
-        <xsd:element ref="dcterms:modified" minOccurs="0" maxOccurs="1"/>
-        <xsd:element name="contentStatus" minOccurs="0" maxOccurs="1" type="xsd:string"/>
-      </xsd:all>
-    </xsd:complexType>
-  </xsd:schema>
-  <xs:schema xmlns:pc="http://schemas.microsoft.com/office/infopath/2007/PartnerControls" xmlns:xs="http://www.w3.org/2001/XMLSchema" targetNamespace="http://schemas.microsoft.com/office/infopath/2007/PartnerControls" elementFormDefault="qualified" attributeFormDefault="unqualified">
-    <xs:element name="Person">
-      <xs:complexType>
-        <xs:sequence>
-          <xs:element ref="pc:DisplayName" minOccurs="0"/>
-          <xs:element ref="pc:AccountId" minOccurs="0"/>
-          <xs:element ref="pc:AccountType" minOccurs="0"/>
-        </xs:sequence>
-      </xs:complexType>
-    </xs:element>
-    <xs:element name="DisplayName" type="xs:string"/>
-    <xs:element name="AccountId" type="xs:string"/>
-    <xs:element name="AccountType" type="xs:string"/>
-    <xs:element name="BDCAssociatedEntity">
-      <xs:complexType>
-        <xs:sequence>
-          <xs:element ref="pc:BDCEntity" minOccurs="0" maxOccurs="unbounded"/>
-        </xs:sequence>
-        <xs:attribute ref="pc:EntityNamespace"/>
-        <xs:attribute ref="pc:EntityName"/>
-        <xs:attribute ref="pc:SystemInstanceName"/>
-        <xs:attribute ref="pc:AssociationName"/>
-      </xs:complexType>
-    </xs:element>
-    <xs:attribute name="EntityNamespace" type="xs:string"/>
-    <xs:attribute name="EntityName" type="xs:string"/>
-    <xs:attribute name="SystemInstanceName" type="xs:string"/>
-    <xs:attribute name="AssociationName" type="xs:string"/>
-    <xs:element name="BDCEntity">
-      <xs:complexType>
-        <xs:sequence>
-          <xs:element ref="pc:EntityDisplayName" minOccurs="0"/>
-          <xs:element ref="pc:EntityInstanceReference" minOccurs="0"/>
-          <xs:element ref="pc:EntityId1" minOccurs="0"/>
-          <xs:element ref="pc:EntityId2" minOccurs="0"/>
-          <xs:element ref="pc:EntityId3" minOccurs="0"/>
-          <xs:element ref="pc:EntityId4" minOccurs="0"/>
-          <xs:element ref="pc:EntityId5" minOccurs="0"/>
-        </xs:sequence>
-      </xs:complexType>
-    </xs:element>
-    <xs:element name="EntityDisplayName" type="xs:string"/>
-    <xs:element name="EntityInstanceReference" type="xs:string"/>
-    <xs:element name="EntityId1" type="xs:string"/>
-    <xs:element name="EntityId2" type="xs:string"/>
-    <xs:element name="EntityId3" type="xs:string"/>
-    <xs:element name="EntityId4" type="xs:string"/>
-    <xs:element name="EntityId5" type="xs:string"/>
-    <xs:element name="Terms">
-      <xs:complexType>
-        <xs:sequence>
-          <xs:element ref="pc:TermInfo" minOccurs="0" maxOccurs="unbounded"/>
-        </xs:sequence>
-      </xs:complexType>
-    </xs:element>
-    <xs:element name="TermInfo">
-      <xs:complexType>
-        <xs:sequence>
-          <xs:element ref="pc:TermName" minOccurs="0"/>
-          <xs:element ref="pc:TermId" minOccurs="0"/>
-        </xs:sequence>
-      </xs:complexType>
-    </xs:element>
-    <xs:element name="TermName" type="xs:string"/>
-    <xs:element name="TermId" type="xs:string"/>
-  </xs:schema>
-</ct:contentTypeSchema>
-</file>
-
-<file path=customXml/item3.xml><?xml version="1.0" encoding="utf-8"?>
-<p:properties xmlns:p="http://schemas.microsoft.com/office/2006/metadata/properties" xmlns:xsi="http://www.w3.org/2001/XMLSchema-instance" xmlns:pc="http://schemas.microsoft.com/office/infopath/2007/PartnerControls">
-  <documentManagement>
-    <TaxCatchAll xmlns="9433aa81-25e7-40b1-9af8-9d2e2c2f9881"/>
-    <lcf76f155ced4ddcb4097134ff3c332f xmlns="22a71077-ce1a-4204-9bb0-58248db92961">
-      <Terms xmlns="http://schemas.microsoft.com/office/infopath/2007/PartnerControls"/>
-    </lcf76f155ced4ddcb4097134ff3c332f>
-  </documentManagement>
-</p:properties>
-</file>
-
-<file path=customXml/item4.xml><?xml version="1.0" encoding="utf-8"?>
-<?mso-contentType ?>
-<FormTemplates xmlns="http://schemas.microsoft.com/sharepoint/v3/contenttype/forms">
-  <Display>DocumentLibraryForm</Display>
-  <Edit>DocumentLibraryForm</Edit>
-  <New>DocumentLibraryForm</New>
-</FormTemplates>
-</file>
-
-<file path=customXml/itemProps1.xml><?xml version="1.0" encoding="utf-8"?>
-<ds:datastoreItem xmlns:ds="http://schemas.openxmlformats.org/officeDocument/2006/customXml" ds:itemID="{33B6F46B-1B78-4017-A25E-60487BE87A9B}">
-  <ds:schemaRefs>
-    <ds:schemaRef ds:uri="http://schemas.openxmlformats.org/officeDocument/2006/bibliography"/>
-  </ds:schemaRefs>
-</ds:datastoreItem>
-</file>
-
-<file path=customXml/itemProps2.xml><?xml version="1.0" encoding="utf-8"?>
-<ds:datastoreItem xmlns:ds="http://schemas.openxmlformats.org/officeDocument/2006/customXml" ds:itemID="{D6436991-ABAF-468F-AB66-364CEE41A3E7}">
-  <ds:schemaRefs>
-    <ds:schemaRef ds:uri="http://schemas.microsoft.com/office/2006/metadata/contentType"/>
-    <ds:schemaRef ds:uri="http://schemas.microsoft.com/office/2006/metadata/properties/metaAttributes"/>
-    <ds:schemaRef ds:uri="http://www.w3.org/2001/XMLSchema"/>
-    <ds:schemaRef ds:uri="http://schemas.microsoft.com/office/2006/metadata/properties"/>
-    <ds:schemaRef ds:uri="22a71077-ce1a-4204-9bb0-58248db92961"/>
-    <ds:schemaRef ds:uri="9433aa81-25e7-40b1-9af8-9d2e2c2f9881"/>
-    <ds:schemaRef ds:uri="http://schemas.microsoft.com/office/2006/documentManagement/types"/>
-    <ds:schemaRef ds:uri="http://schemas.microsoft.com/office/infopath/2007/PartnerControls"/>
-    <ds:schemaRef ds:uri="http://schemas.openxmlformats.org/package/2006/metadata/core-properties"/>
-    <ds:schemaRef ds:uri="http://purl.org/dc/elements/1.1/"/>
-    <ds:schemaRef ds:uri="http://purl.org/dc/terms/"/>
-    <ds:schemaRef ds:uri="http://schemas.microsoft.com/internal/obd"/>
-  </ds:schemaRefs>
-</ds:datastoreItem>
-</file>
-
-<file path=customXml/itemProps3.xml><?xml version="1.0" encoding="utf-8"?>
-<ds:datastoreItem xmlns:ds="http://schemas.openxmlformats.org/officeDocument/2006/customXml" ds:itemID="{27B4FD52-1CD9-4A17-B58C-D0209F68D4F8}">
-  <ds:schemaRefs>
-    <ds:schemaRef ds:uri="http://schemas.microsoft.com/office/2006/metadata/properties"/>
-    <ds:schemaRef ds:uri="http://schemas.microsoft.com/office/infopath/2007/PartnerControls"/>
-    <ds:schemaRef ds:uri="9433aa81-25e7-40b1-9af8-9d2e2c2f9881"/>
-    <ds:schemaRef ds:uri="22a71077-ce1a-4204-9bb0-58248db92961"/>
-  </ds:schemaRefs>
-</ds:datastoreItem>
-</file>
-
-<file path=customXml/itemProps4.xml><?xml version="1.0" encoding="utf-8"?>
-<ds:datastoreItem xmlns:ds="http://schemas.openxmlformats.org/officeDocument/2006/customXml" ds:itemID="{C92EA4CB-8061-4434-9B9A-0BEAFF6FD706}">
-  <ds:schemaRefs>
-    <ds:schemaRef ds:uri="http://schemas.microsoft.com/sharepoint/v3/contenttype/forms"/>
-  </ds:schemaRefs>
-</ds:datastoreItem>
 </file>
</xml_diff>

<commit_message>
drobné úpravy: text, layout, docs
</commit_message>
<xml_diff>
--- a/word-templates/shrnuti-template.docx
+++ b/word-templates/shrnuti-template.docx
@@ -81,7 +81,13 @@
         <w:rPr>
           <w:i/>
         </w:rPr>
-        <w:t>Interaktivní aplikace/2025</w:t>
+        <w:t>Interaktivní aplikace/202</w:t>
+      </w:r>
+      <w:r>
+        <w:rPr>
+          <w:i/>
+        </w:rPr>
+        <w:t>6</w:t>
       </w:r>
     </w:p>
     <w:p>
@@ -2562,7 +2568,7 @@
         <w:sz w:val="16"/>
         <w:szCs w:val="16"/>
       </w:rPr>
-      <w:t xml:space="preserve">            </w:t>
+      <w:t xml:space="preserve">           </w:t>
     </w:r>
     <w:r>
       <w:rPr>
@@ -2592,7 +2598,7 @@
         <w:sz w:val="16"/>
         <w:szCs w:val="16"/>
       </w:rPr>
-      <w:t>5</w:t>
+      <w:t>6</w:t>
     </w:r>
   </w:p>
   <w:p>
@@ -7506,6 +7512,7 @@
   <w:style w:type="character" w:default="1" w:styleId="DefaultParagraphFont">
     <w:name w:val="Default Paragraph Font"/>
     <w:uiPriority w:val="1"/>
+    <w:semiHidden/>
     <w:unhideWhenUsed/>
   </w:style>
   <w:style w:type="table" w:default="1" w:styleId="TableNormal">

</xml_diff>